<commit_message>
feat: align lesson kit and trainer
</commit_message>
<xml_diff>
--- a/methodical-development/Defense_script_5_minutes.docx
+++ b/methodical-development/Defense_script_5_minutes.docx
@@ -5,44 +5,17 @@
     <w:p>
       <w:pPr>
         <w:pStyle w:val="Title"/>
-        <w:spacing w:after="140"/>
       </w:pPr>
       <w:r>
-        <w:rPr>
-          <w:rFonts w:ascii="Arial" w:hAnsi="Arial" w:eastAsia="Arial"/>
-          <w:b/>
-          <w:color w:val="111111"/>
-          <w:sz w:val="48"/>
-        </w:rPr>
-        <w:t>Сценарий защиты проекта Тьюринг под лупой</w:t>
+        <w:t>Сценарий пятиминутной защиты</w:t>
       </w:r>
     </w:p>
     <w:p>
       <w:pPr>
-        <w:spacing w:after="280"/>
+        <w:spacing w:after="240"/>
       </w:pPr>
       <w:r>
-        <w:rPr>
-          <w:rFonts w:ascii="Arial" w:hAnsi="Arial" w:eastAsia="Arial"/>
-          <w:b w:val="0"/>
-          <w:color w:val="606067"/>
-          <w:sz w:val="24"/>
-        </w:rPr>
-        <w:t>Один докладчик  Общий лимит 5 минут вместе с вопросами</w:t>
-      </w:r>
-    </w:p>
-    <w:p>
-      <w:pPr>
-        <w:spacing w:after="120" w:line="259" w:lineRule="auto"/>
-      </w:pPr>
-      <w:r>
-        <w:rPr>
-          <w:rFonts w:ascii="Arial" w:hAnsi="Arial" w:eastAsia="Arial"/>
-          <w:b w:val="0"/>
-          <w:color w:val="111111"/>
-          <w:sz w:val="23"/>
-        </w:rPr>
-        <w:t>Основной текст рассчитан примерно на 3 минуты 28 секунд при спокойном темпе. Оставшиеся 1 минуту 32 секунды следует сохранить для вопросов комиссии. Девятый слайд остаётся на экране во время ответов.</w:t>
+        <w:t>Текст синхронизирован с актуальной презентацией из девяти слайдов. Основной рассказ рассчитан примерно на четыре минуты, остаток оставлен для переходов и вопросов. Оценка времени ориентировочная и не выдаётся за результат репетиции.</w:t>
       </w:r>
     </w:p>
     <w:p>
@@ -50,44 +23,245 @@
         <w:pStyle w:val="Heading1"/>
       </w:pPr>
       <w:r>
+        <w:t>1. Тьюринг под лупой</w:t>
+      </w:r>
+    </w:p>
+    <w:p>
+      <w:r>
+        <w:t>Представляю проектное занятие для 11 класса по информатике и математике. За два урока команды создают диагностический маршрут выбора способа решения.</w:t>
+      </w:r>
+    </w:p>
+    <w:p>
+      <w:r>
         <w:rPr>
-          <w:rFonts w:ascii="Arial" w:hAnsi="Arial" w:eastAsia="Arial"/>
           <w:b/>
-          <w:color w:val="111111"/>
-          <w:sz w:val="34"/>
         </w:rPr>
-        <w:t>Контроль хронометража</w:t>
+        <w:t xml:space="preserve">Сокращённо: </w:t>
+      </w:r>
+      <w:r>
+        <w:t>Цель — готовый маршрут выбора стратегии.</w:t>
+      </w:r>
+    </w:p>
+    <w:p>
+      <w:pPr>
+        <w:pStyle w:val="Heading1"/>
+      </w:pPr>
+      <w:r>
+        <w:t>2. Учебная проблема</w:t>
+      </w:r>
+    </w:p>
+    <w:p>
+      <w:r>
+        <w:t>Полная трассировка полезна, но на длинной ленте увеличивает время и риск счётной ошибки. Ученик должен понимать, когда достаточно проверить цикл и перейти к анализу.</w:t>
+      </w:r>
+    </w:p>
+    <w:p>
+      <w:r>
+        <w:rPr>
+          <w:b/>
+        </w:rPr>
+        <w:t xml:space="preserve">Сокращённо: </w:t>
+      </w:r>
+      <w:r>
+        <w:t>Проблема — осознанный выбор способа.</w:t>
+      </w:r>
+    </w:p>
+    <w:p>
+      <w:pPr>
+        <w:pStyle w:val="Heading1"/>
+      </w:pPr>
+      <w:r>
+        <w:t>3. Продукт ученика</w:t>
+      </w:r>
+    </w:p>
+    <w:p>
+      <w:r>
+        <w:t>Маршрут различает полную трассировку, несколько проверочных шагов с анализом и аналитическое решение. Он включает примеры, карту ошибок и проверку другой командой.</w:t>
+      </w:r>
+    </w:p>
+    <w:p>
+      <w:r>
+        <w:rPr>
+          <w:b/>
+        </w:rPr>
+        <w:t xml:space="preserve">Сокращённо: </w:t>
+      </w:r>
+      <w:r>
+        <w:t>Продукт — диагностический маршрут.</w:t>
+      </w:r>
+    </w:p>
+    <w:p>
+      <w:pPr>
+        <w:pStyle w:val="Heading1"/>
+      </w:pPr>
+      <w:r>
+        <w:t>4. Два урока</w:t>
+      </w:r>
+    </w:p>
+    <w:p>
+      <w:r>
+        <w:t>Пять этапов занимают 10, 20, 15, 30 и 15 минут. В расписании есть входной мини-тест, обязательный кейс, перекрёстная проверка и индивидуальный КИМ.</w:t>
+      </w:r>
+    </w:p>
+    <w:p>
+      <w:r>
+        <w:rPr>
+          <w:b/>
+        </w:rPr>
+        <w:t xml:space="preserve">Сокращённо: </w:t>
+      </w:r>
+      <w:r>
+        <w:t>Два урока содержат все обязательные процедуры.</w:t>
+      </w:r>
+    </w:p>
+    <w:p>
+      <w:pPr>
+        <w:pStyle w:val="Heading1"/>
+      </w:pPr>
+      <w:r>
+        <w:t>5. Контролируемая пара</w:t>
+      </w:r>
+    </w:p>
+    <w:p>
+      <w:r>
+        <w:t>Попытка 1 свободная и показывает исходный способ. Эксперимент сравнивает только попытки 2 и 3: полную трассировку и четыре проверочных шага с последующим анализом.</w:t>
+      </w:r>
+    </w:p>
+    <w:p>
+      <w:r>
+        <w:rPr>
+          <w:b/>
+        </w:rPr>
+        <w:t xml:space="preserve">Сокращённо: </w:t>
+      </w:r>
+      <w:r>
+        <w:t>Сравниваются только попытки 2 и 3.</w:t>
+      </w:r>
+    </w:p>
+    <w:p>
+      <w:pPr>
+        <w:pStyle w:val="Heading1"/>
+      </w:pPr>
+      <w:r>
+        <w:t>6. Материалы</w:t>
+      </w:r>
+    </w:p>
+    <w:p>
+      <w:r>
+        <w:t>Комплект включает рабочий лист, карточки пары, резерв без компьютера, проектное задание, шаблон и заполненный пример маршрута, рубрикатор и КИМы.</w:t>
+      </w:r>
+    </w:p>
+    <w:p>
+      <w:r>
+        <w:rPr>
+          <w:b/>
+        </w:rPr>
+        <w:t xml:space="preserve">Сокращённо: </w:t>
+      </w:r>
+      <w:r>
+        <w:t>Материалы готовы к проведению.</w:t>
+      </w:r>
+    </w:p>
+    <w:p>
+      <w:pPr>
+        <w:pStyle w:val="Heading1"/>
+      </w:pPr>
+      <w:r>
+        <w:t>7. Оценивание</w:t>
+      </w:r>
+    </w:p>
+    <w:p>
+      <w:r>
+        <w:t>Пять критериев дают до 15 баллов, но обязательные условия принятия важнее суммы. Перенос на КИМ требует верного ответа, объяснения цикла и остатка без подсказок.</w:t>
+      </w:r>
+    </w:p>
+    <w:p>
+      <w:r>
+        <w:rPr>
+          <w:b/>
+        </w:rPr>
+        <w:t xml:space="preserve">Сокращённо: </w:t>
+      </w:r>
+      <w:r>
+        <w:t>Баллы не отменяют обязательные условия.</w:t>
+      </w:r>
+    </w:p>
+    <w:p>
+      <w:pPr>
+        <w:pStyle w:val="Heading1"/>
+      </w:pPr>
+      <w:r>
+        <w:t>8. Роль тренажёра и ИИ</w:t>
+      </w:r>
+    </w:p>
+    <w:p>
+      <w:r>
+        <w:t>Тренажёр служит исследовательским стендом. Обязательный кейс выполняют все. ИИ необязателен; использованное утверждение проверяют по таблице и дополнительному примеру.</w:t>
+      </w:r>
+    </w:p>
+    <w:p>
+      <w:r>
+        <w:rPr>
+          <w:b/>
+        </w:rPr>
+        <w:t xml:space="preserve">Сокращённо: </w:t>
+      </w:r>
+      <w:r>
+        <w:t>Тренажёр поддерживает исследование; ИИ необязателен.</w:t>
+      </w:r>
+    </w:p>
+    <w:p>
+      <w:pPr>
+        <w:pStyle w:val="Heading1"/>
+      </w:pPr>
+      <w:r>
+        <w:t>9. Готовность и границы</w:t>
+      </w:r>
+    </w:p>
+    <w:p>
+      <w:r>
+        <w:t>Готовы тренажёр и перечисленные материалы. Целевые проценты относятся к будущему проведению. Мы не заявляем апробацию, публикацию ученических продуктов или публичный адрес.</w:t>
+      </w:r>
+    </w:p>
+    <w:p>
+      <w:r>
+        <w:rPr>
+          <w:b/>
+        </w:rPr>
+        <w:t xml:space="preserve">Сокращённо: </w:t>
+      </w:r>
+      <w:r>
+        <w:t>Готовность подтверждается файлами, а не придуманными результатами.</w:t>
+      </w:r>
+    </w:p>
+    <w:p>
+      <w:pPr>
+        <w:pStyle w:val="Heading1"/>
+      </w:pPr>
+      <w:r>
+        <w:t>Ответы на вопросы</w:t>
       </w:r>
     </w:p>
     <w:tbl>
       <w:tblPr>
+        <w:tblStyle w:val="TableGrid"/>
         <w:tblW w:type="auto" w:w="0"/>
         <w:jc w:val="center"/>
-        <w:tblLayout w:type="fixed"/>
         <w:tblLook w:firstColumn="1" w:firstRow="1" w:lastColumn="0" w:lastRow="0" w:noHBand="0" w:noVBand="1" w:val="04A0"/>
       </w:tblPr>
       <w:tblGrid>
-        <w:gridCol w:w="3331"/>
-        <w:gridCol w:w="3331"/>
-        <w:gridCol w:w="3331"/>
+        <w:gridCol w:w="4986"/>
+        <w:gridCol w:w="4986"/>
       </w:tblGrid>
       <w:tr>
         <w:trPr>
-          <w:tblHeader w:val="true"/>
+          <w:tblHeader/>
         </w:trPr>
         <w:tc>
           <w:tcPr>
-            <w:tcW w:type="dxa" w:w="893"/>
+            <w:tcW w:type="dxa" w:w="4986"/>
+            <w:shd w:fill="1F4E78"/>
             <w:vAlign w:val="center"/>
-            <w:shd w:fill="111111"/>
-            <w:tcBorders>
-              <w:top w:val="single" w:sz="6" w:color="D9D9DE"/>
-              <w:left w:val="single" w:sz="6" w:color="D9D9DE"/>
-              <w:bottom w:val="single" w:sz="6" w:color="D9D9DE"/>
-              <w:right w:val="single" w:sz="6" w:color="D9D9DE"/>
-              <w:insideH w:val="single" w:sz="6" w:color="D9D9DE"/>
-              <w:insideV w:val="single" w:sz="6" w:color="D9D9DE"/>
-            </w:tcBorders>
             <w:tcMar>
               <w:top w:w="100" w:type="dxa"/>
               <w:start w:w="120" w:type="dxa"/>
@@ -96,33 +270,20 @@
             </w:tcMar>
           </w:tcPr>
           <w:p>
-            <w:pPr>
-              <w:jc w:val="center"/>
-            </w:pPr>
             <w:r>
               <w:rPr>
-                <w:rFonts w:ascii="Arial" w:hAnsi="Arial" w:eastAsia="Arial"/>
                 <w:b/>
                 <w:color w:val="FFFFFF"/>
-                <w:sz w:val="21"/>
               </w:rPr>
-              <w:t>Слайд</w:t>
+              <w:t>Вопрос</w:t>
             </w:r>
           </w:p>
         </w:tc>
         <w:tc>
           <w:tcPr>
-            <w:tcW w:type="dxa" w:w="1843"/>
+            <w:tcW w:type="dxa" w:w="4986"/>
+            <w:shd w:fill="1F4E78"/>
             <w:vAlign w:val="center"/>
-            <w:shd w:fill="111111"/>
-            <w:tcBorders>
-              <w:top w:val="single" w:sz="6" w:color="D9D9DE"/>
-              <w:left w:val="single" w:sz="6" w:color="D9D9DE"/>
-              <w:bottom w:val="single" w:sz="6" w:color="D9D9DE"/>
-              <w:right w:val="single" w:sz="6" w:color="D9D9DE"/>
-              <w:insideH w:val="single" w:sz="6" w:color="D9D9DE"/>
-              <w:insideV w:val="single" w:sz="6" w:color="D9D9DE"/>
-            </w:tcBorders>
             <w:tcMar>
               <w:top w:w="100" w:type="dxa"/>
               <w:start w:w="120" w:type="dxa"/>
@@ -131,52 +292,12 @@
             </w:tcMar>
           </w:tcPr>
           <w:p>
-            <w:pPr>
-              <w:jc w:val="center"/>
-            </w:pPr>
             <w:r>
               <w:rPr>
-                <w:rFonts w:ascii="Arial" w:hAnsi="Arial" w:eastAsia="Arial"/>
                 <w:b/>
                 <w:color w:val="FFFFFF"/>
-                <w:sz w:val="21"/>
               </w:rPr>
-              <w:t>Время</w:t>
-            </w:r>
-          </w:p>
-        </w:tc>
-        <w:tc>
-          <w:tcPr>
-            <w:tcW w:type="dxa" w:w="7200"/>
-            <w:vAlign w:val="center"/>
-            <w:shd w:fill="111111"/>
-            <w:tcBorders>
-              <w:top w:val="single" w:sz="6" w:color="D9D9DE"/>
-              <w:left w:val="single" w:sz="6" w:color="D9D9DE"/>
-              <w:bottom w:val="single" w:sz="6" w:color="D9D9DE"/>
-              <w:right w:val="single" w:sz="6" w:color="D9D9DE"/>
-              <w:insideH w:val="single" w:sz="6" w:color="D9D9DE"/>
-              <w:insideV w:val="single" w:sz="6" w:color="D9D9DE"/>
-            </w:tcBorders>
-            <w:tcMar>
-              <w:top w:w="100" w:type="dxa"/>
-              <w:start w:w="120" w:type="dxa"/>
-              <w:bottom w:w="100" w:type="dxa"/>
-              <w:end w:w="120" w:type="dxa"/>
-            </w:tcMar>
-          </w:tcPr>
-          <w:p>
-            <w:pPr>
-              <w:jc w:val="left"/>
-            </w:pPr>
-            <w:r>
-              <w:rPr>
-                <w:rFonts w:ascii="Arial" w:hAnsi="Arial" w:eastAsia="Arial"/>
-                <w:b/>
-                <w:color w:val="FFFFFF"/>
-                <w:sz w:val="21"/>
-              </w:rPr>
-              <w:t>Задача</w:t>
+              <w:t>Ответ</w:t>
             </w:r>
           </w:p>
         </w:tc>
@@ -187,103 +308,35 @@
         </w:trPr>
         <w:tc>
           <w:tcPr>
-            <w:tcW w:type="dxa" w:w="893"/>
+            <w:tcW w:type="dxa" w:w="4986"/>
             <w:vAlign w:val="center"/>
-            <w:tcBorders>
-              <w:top w:val="single" w:sz="6" w:color="D9D9DE"/>
-              <w:left w:val="single" w:sz="6" w:color="D9D9DE"/>
-              <w:bottom w:val="single" w:sz="6" w:color="D9D9DE"/>
-              <w:right w:val="single" w:sz="6" w:color="D9D9DE"/>
-              <w:insideH w:val="single" w:sz="6" w:color="D9D9DE"/>
-              <w:insideV w:val="single" w:sz="6" w:color="D9D9DE"/>
-            </w:tcBorders>
             <w:tcMar>
-              <w:top w:w="75" w:type="dxa"/>
+              <w:top w:w="100" w:type="dxa"/>
               <w:start w:w="120" w:type="dxa"/>
-              <w:bottom w:w="75" w:type="dxa"/>
+              <w:bottom w:w="100" w:type="dxa"/>
               <w:end w:w="120" w:type="dxa"/>
             </w:tcMar>
           </w:tcPr>
           <w:p>
-            <w:pPr>
-              <w:jc w:val="center"/>
-            </w:pPr>
             <w:r>
-              <w:rPr>
-                <w:rFonts w:ascii="Arial" w:hAnsi="Arial" w:eastAsia="Arial"/>
-                <w:b/>
-                <w:color w:val="111111"/>
-                <w:sz w:val="20"/>
-              </w:rPr>
-              <w:t>1</w:t>
+              <w:t>Что сравнивают?</w:t>
             </w:r>
           </w:p>
         </w:tc>
         <w:tc>
           <w:tcPr>
-            <w:tcW w:type="dxa" w:w="1843"/>
+            <w:tcW w:type="dxa" w:w="4986"/>
             <w:vAlign w:val="center"/>
-            <w:tcBorders>
-              <w:top w:val="single" w:sz="6" w:color="D9D9DE"/>
-              <w:left w:val="single" w:sz="6" w:color="D9D9DE"/>
-              <w:bottom w:val="single" w:sz="6" w:color="D9D9DE"/>
-              <w:right w:val="single" w:sz="6" w:color="D9D9DE"/>
-              <w:insideH w:val="single" w:sz="6" w:color="D9D9DE"/>
-              <w:insideV w:val="single" w:sz="6" w:color="D9D9DE"/>
-            </w:tcBorders>
             <w:tcMar>
-              <w:top w:w="75" w:type="dxa"/>
+              <w:top w:w="100" w:type="dxa"/>
               <w:start w:w="120" w:type="dxa"/>
-              <w:bottom w:w="75" w:type="dxa"/>
+              <w:bottom w:w="100" w:type="dxa"/>
               <w:end w:w="120" w:type="dxa"/>
             </w:tcMar>
           </w:tcPr>
           <w:p>
-            <w:pPr>
-              <w:jc w:val="center"/>
-            </w:pPr>
             <w:r>
-              <w:rPr>
-                <w:rFonts w:ascii="Arial" w:hAnsi="Arial" w:eastAsia="Arial"/>
-                <w:b w:val="0"/>
-                <w:color w:val="111111"/>
-                <w:sz w:val="20"/>
-              </w:rPr>
-              <w:t>0:00-0:12</w:t>
-            </w:r>
-          </w:p>
-        </w:tc>
-        <w:tc>
-          <w:tcPr>
-            <w:tcW w:type="dxa" w:w="7200"/>
-            <w:vAlign w:val="center"/>
-            <w:tcBorders>
-              <w:top w:val="single" w:sz="6" w:color="D9D9DE"/>
-              <w:left w:val="single" w:sz="6" w:color="D9D9DE"/>
-              <w:bottom w:val="single" w:sz="6" w:color="D9D9DE"/>
-              <w:right w:val="single" w:sz="6" w:color="D9D9DE"/>
-              <w:insideH w:val="single" w:sz="6" w:color="D9D9DE"/>
-              <w:insideV w:val="single" w:sz="6" w:color="D9D9DE"/>
-            </w:tcBorders>
-            <w:tcMar>
-              <w:top w:w="75" w:type="dxa"/>
-              <w:start w:w="120" w:type="dxa"/>
-              <w:bottom w:w="75" w:type="dxa"/>
-              <w:end w:w="120" w:type="dxa"/>
-            </w:tcMar>
-          </w:tcPr>
-          <w:p>
-            <w:pPr>
-              <w:jc w:val="left"/>
-            </w:pPr>
-            <w:r>
-              <w:rPr>
-                <w:rFonts w:ascii="Arial" w:hAnsi="Arial" w:eastAsia="Arial"/>
-                <w:b w:val="0"/>
-                <w:color w:val="111111"/>
-                <w:sz w:val="20"/>
-              </w:rPr>
-              <w:t>Титул и назначение разработки</w:t>
+              <w:t>Только контролируемую пару попыток 2 и 3.</w:t>
             </w:r>
           </w:p>
         </w:tc>
@@ -294,106 +347,37 @@
         </w:trPr>
         <w:tc>
           <w:tcPr>
-            <w:tcW w:type="dxa" w:w="893"/>
+            <w:tcW w:type="dxa" w:w="4986"/>
             <w:vAlign w:val="center"/>
-            <w:tcBorders>
-              <w:top w:val="single" w:sz="6" w:color="D9D9DE"/>
-              <w:left w:val="single" w:sz="6" w:color="D9D9DE"/>
-              <w:bottom w:val="single" w:sz="6" w:color="D9D9DE"/>
-              <w:right w:val="single" w:sz="6" w:color="D9D9DE"/>
-              <w:insideH w:val="single" w:sz="6" w:color="D9D9DE"/>
-              <w:insideV w:val="single" w:sz="6" w:color="D9D9DE"/>
-            </w:tcBorders>
             <w:tcMar>
-              <w:top w:w="75" w:type="dxa"/>
+              <w:top w:w="100" w:type="dxa"/>
               <w:start w:w="120" w:type="dxa"/>
-              <w:bottom w:w="75" w:type="dxa"/>
+              <w:bottom w:w="100" w:type="dxa"/>
               <w:end w:w="120" w:type="dxa"/>
             </w:tcMar>
-            <w:shd w:fill="F5F5F6"/>
+            <w:shd w:fill="F4F7FA"/>
           </w:tcPr>
           <w:p>
-            <w:pPr>
-              <w:jc w:val="center"/>
-            </w:pPr>
             <w:r>
-              <w:rPr>
-                <w:rFonts w:ascii="Arial" w:hAnsi="Arial" w:eastAsia="Arial"/>
-                <w:b/>
-                <w:color w:val="111111"/>
-                <w:sz w:val="20"/>
-              </w:rPr>
-              <w:t>2</w:t>
+              <w:t>Доказана ли эффективность метода?</w:t>
             </w:r>
           </w:p>
         </w:tc>
         <w:tc>
           <w:tcPr>
-            <w:tcW w:type="dxa" w:w="1843"/>
+            <w:tcW w:type="dxa" w:w="4986"/>
             <w:vAlign w:val="center"/>
-            <w:tcBorders>
-              <w:top w:val="single" w:sz="6" w:color="D9D9DE"/>
-              <w:left w:val="single" w:sz="6" w:color="D9D9DE"/>
-              <w:bottom w:val="single" w:sz="6" w:color="D9D9DE"/>
-              <w:right w:val="single" w:sz="6" w:color="D9D9DE"/>
-              <w:insideH w:val="single" w:sz="6" w:color="D9D9DE"/>
-              <w:insideV w:val="single" w:sz="6" w:color="D9D9DE"/>
-            </w:tcBorders>
             <w:tcMar>
-              <w:top w:w="75" w:type="dxa"/>
+              <w:top w:w="100" w:type="dxa"/>
               <w:start w:w="120" w:type="dxa"/>
-              <w:bottom w:w="75" w:type="dxa"/>
+              <w:bottom w:w="100" w:type="dxa"/>
               <w:end w:w="120" w:type="dxa"/>
             </w:tcMar>
-            <w:shd w:fill="F5F5F6"/>
+            <w:shd w:fill="F4F7FA"/>
           </w:tcPr>
           <w:p>
-            <w:pPr>
-              <w:jc w:val="center"/>
-            </w:pPr>
             <w:r>
-              <w:rPr>
-                <w:rFonts w:ascii="Arial" w:hAnsi="Arial" w:eastAsia="Arial"/>
-                <w:b w:val="0"/>
-                <w:color w:val="111111"/>
-                <w:sz w:val="20"/>
-              </w:rPr>
-              <w:t>0:12-0:32</w:t>
-            </w:r>
-          </w:p>
-        </w:tc>
-        <w:tc>
-          <w:tcPr>
-            <w:tcW w:type="dxa" w:w="7200"/>
-            <w:vAlign w:val="center"/>
-            <w:tcBorders>
-              <w:top w:val="single" w:sz="6" w:color="D9D9DE"/>
-              <w:left w:val="single" w:sz="6" w:color="D9D9DE"/>
-              <w:bottom w:val="single" w:sz="6" w:color="D9D9DE"/>
-              <w:right w:val="single" w:sz="6" w:color="D9D9DE"/>
-              <w:insideH w:val="single" w:sz="6" w:color="D9D9DE"/>
-              <w:insideV w:val="single" w:sz="6" w:color="D9D9DE"/>
-            </w:tcBorders>
-            <w:tcMar>
-              <w:top w:w="75" w:type="dxa"/>
-              <w:start w:w="120" w:type="dxa"/>
-              <w:bottom w:w="75" w:type="dxa"/>
-              <w:end w:w="120" w:type="dxa"/>
-            </w:tcMar>
-            <w:shd w:fill="F5F5F6"/>
-          </w:tcPr>
-          <w:p>
-            <w:pPr>
-              <w:jc w:val="left"/>
-            </w:pPr>
-            <w:r>
-              <w:rPr>
-                <w:rFonts w:ascii="Arial" w:hAnsi="Arial" w:eastAsia="Arial"/>
-                <w:b w:val="0"/>
-                <w:color w:val="111111"/>
-                <w:sz w:val="20"/>
-              </w:rPr>
-              <w:t>Формат занятия и ученический продукт</w:t>
+              <w:t>Нет. Две попытки дают учебное наблюдение, а не строгое доказательство.</w:t>
             </w:r>
           </w:p>
         </w:tc>
@@ -404,103 +388,35 @@
         </w:trPr>
         <w:tc>
           <w:tcPr>
-            <w:tcW w:type="dxa" w:w="893"/>
+            <w:tcW w:type="dxa" w:w="4986"/>
             <w:vAlign w:val="center"/>
-            <w:tcBorders>
-              <w:top w:val="single" w:sz="6" w:color="D9D9DE"/>
-              <w:left w:val="single" w:sz="6" w:color="D9D9DE"/>
-              <w:bottom w:val="single" w:sz="6" w:color="D9D9DE"/>
-              <w:right w:val="single" w:sz="6" w:color="D9D9DE"/>
-              <w:insideH w:val="single" w:sz="6" w:color="D9D9DE"/>
-              <w:insideV w:val="single" w:sz="6" w:color="D9D9DE"/>
-            </w:tcBorders>
             <w:tcMar>
-              <w:top w:w="75" w:type="dxa"/>
+              <w:top w:w="100" w:type="dxa"/>
               <w:start w:w="120" w:type="dxa"/>
-              <w:bottom w:w="75" w:type="dxa"/>
+              <w:bottom w:w="100" w:type="dxa"/>
               <w:end w:w="120" w:type="dxa"/>
             </w:tcMar>
           </w:tcPr>
           <w:p>
-            <w:pPr>
-              <w:jc w:val="center"/>
-            </w:pPr>
             <w:r>
-              <w:rPr>
-                <w:rFonts w:ascii="Arial" w:hAnsi="Arial" w:eastAsia="Arial"/>
-                <w:b/>
-                <w:color w:val="111111"/>
-                <w:sz w:val="20"/>
-              </w:rPr>
-              <w:t>3</w:t>
+              <w:t>Обязателен ли ИИ?</w:t>
             </w:r>
           </w:p>
         </w:tc>
         <w:tc>
           <w:tcPr>
-            <w:tcW w:type="dxa" w:w="1843"/>
+            <w:tcW w:type="dxa" w:w="4986"/>
             <w:vAlign w:val="center"/>
-            <w:tcBorders>
-              <w:top w:val="single" w:sz="6" w:color="D9D9DE"/>
-              <w:left w:val="single" w:sz="6" w:color="D9D9DE"/>
-              <w:bottom w:val="single" w:sz="6" w:color="D9D9DE"/>
-              <w:right w:val="single" w:sz="6" w:color="D9D9DE"/>
-              <w:insideH w:val="single" w:sz="6" w:color="D9D9DE"/>
-              <w:insideV w:val="single" w:sz="6" w:color="D9D9DE"/>
-            </w:tcBorders>
             <w:tcMar>
-              <w:top w:w="75" w:type="dxa"/>
+              <w:top w:w="100" w:type="dxa"/>
               <w:start w:w="120" w:type="dxa"/>
-              <w:bottom w:w="75" w:type="dxa"/>
+              <w:bottom w:w="100" w:type="dxa"/>
               <w:end w:w="120" w:type="dxa"/>
             </w:tcMar>
           </w:tcPr>
           <w:p>
-            <w:pPr>
-              <w:jc w:val="center"/>
-            </w:pPr>
             <w:r>
-              <w:rPr>
-                <w:rFonts w:ascii="Arial" w:hAnsi="Arial" w:eastAsia="Arial"/>
-                <w:b w:val="0"/>
-                <w:color w:val="111111"/>
-                <w:sz w:val="20"/>
-              </w:rPr>
-              <w:t>0:32-1:00</w:t>
-            </w:r>
-          </w:p>
-        </w:tc>
-        <w:tc>
-          <w:tcPr>
-            <w:tcW w:type="dxa" w:w="7200"/>
-            <w:vAlign w:val="center"/>
-            <w:tcBorders>
-              <w:top w:val="single" w:sz="6" w:color="D9D9DE"/>
-              <w:left w:val="single" w:sz="6" w:color="D9D9DE"/>
-              <w:bottom w:val="single" w:sz="6" w:color="D9D9DE"/>
-              <w:right w:val="single" w:sz="6" w:color="D9D9DE"/>
-              <w:insideH w:val="single" w:sz="6" w:color="D9D9DE"/>
-              <w:insideV w:val="single" w:sz="6" w:color="D9D9DE"/>
-            </w:tcBorders>
-            <w:tcMar>
-              <w:top w:w="75" w:type="dxa"/>
-              <w:start w:w="120" w:type="dxa"/>
-              <w:bottom w:w="75" w:type="dxa"/>
-              <w:end w:w="120" w:type="dxa"/>
-            </w:tcMar>
-          </w:tcPr>
-          <w:p>
-            <w:pPr>
-              <w:jc w:val="left"/>
-            </w:pPr>
-            <w:r>
-              <w:rPr>
-                <w:rFonts w:ascii="Arial" w:hAnsi="Arial" w:eastAsia="Arial"/>
-                <w:b w:val="0"/>
-                <w:color w:val="111111"/>
-                <w:sz w:val="20"/>
-              </w:rPr>
-              <w:t>Проблема механической трассировки</w:t>
+              <w:t>Нет. Обязателен практический кейс; ИИ при использовании проверяется.</w:t>
             </w:r>
           </w:p>
         </w:tc>
@@ -511,2273 +427,109 @@
         </w:trPr>
         <w:tc>
           <w:tcPr>
-            <w:tcW w:type="dxa" w:w="893"/>
+            <w:tcW w:type="dxa" w:w="4986"/>
             <w:vAlign w:val="center"/>
-            <w:tcBorders>
-              <w:top w:val="single" w:sz="6" w:color="D9D9DE"/>
-              <w:left w:val="single" w:sz="6" w:color="D9D9DE"/>
-              <w:bottom w:val="single" w:sz="6" w:color="D9D9DE"/>
-              <w:right w:val="single" w:sz="6" w:color="D9D9DE"/>
-              <w:insideH w:val="single" w:sz="6" w:color="D9D9DE"/>
-              <w:insideV w:val="single" w:sz="6" w:color="D9D9DE"/>
-            </w:tcBorders>
-            <w:tcMar>
-              <w:top w:w="75" w:type="dxa"/>
-              <w:start w:w="120" w:type="dxa"/>
-              <w:bottom w:w="75" w:type="dxa"/>
-              <w:end w:w="120" w:type="dxa"/>
-            </w:tcMar>
-            <w:shd w:fill="F5F5F6"/>
-          </w:tcPr>
-          <w:p>
-            <w:pPr>
-              <w:jc w:val="center"/>
-            </w:pPr>
-            <w:r>
-              <w:rPr>
-                <w:rFonts w:ascii="Arial" w:hAnsi="Arial" w:eastAsia="Arial"/>
-                <w:b/>
-                <w:color w:val="111111"/>
-                <w:sz w:val="20"/>
-              </w:rPr>
-              <w:t>4</w:t>
-            </w:r>
-          </w:p>
-        </w:tc>
-        <w:tc>
-          <w:tcPr>
-            <w:tcW w:type="dxa" w:w="1843"/>
-            <w:vAlign w:val="center"/>
-            <w:tcBorders>
-              <w:top w:val="single" w:sz="6" w:color="D9D9DE"/>
-              <w:left w:val="single" w:sz="6" w:color="D9D9DE"/>
-              <w:bottom w:val="single" w:sz="6" w:color="D9D9DE"/>
-              <w:right w:val="single" w:sz="6" w:color="D9D9DE"/>
-              <w:insideH w:val="single" w:sz="6" w:color="D9D9DE"/>
-              <w:insideV w:val="single" w:sz="6" w:color="D9D9DE"/>
-            </w:tcBorders>
-            <w:tcMar>
-              <w:top w:w="75" w:type="dxa"/>
-              <w:start w:w="120" w:type="dxa"/>
-              <w:bottom w:w="75" w:type="dxa"/>
-              <w:end w:w="120" w:type="dxa"/>
-            </w:tcMar>
-            <w:shd w:fill="F5F5F6"/>
-          </w:tcPr>
-          <w:p>
-            <w:pPr>
-              <w:jc w:val="center"/>
-            </w:pPr>
-            <w:r>
-              <w:rPr>
-                <w:rFonts w:ascii="Arial" w:hAnsi="Arial" w:eastAsia="Arial"/>
-                <w:b w:val="0"/>
-                <w:color w:val="111111"/>
-                <w:sz w:val="20"/>
-              </w:rPr>
-              <w:t>1:00-1:27</w:t>
-            </w:r>
-          </w:p>
-        </w:tc>
-        <w:tc>
-          <w:tcPr>
-            <w:tcW w:type="dxa" w:w="7200"/>
-            <w:vAlign w:val="center"/>
-            <w:tcBorders>
-              <w:top w:val="single" w:sz="6" w:color="D9D9DE"/>
-              <w:left w:val="single" w:sz="6" w:color="D9D9DE"/>
-              <w:bottom w:val="single" w:sz="6" w:color="D9D9DE"/>
-              <w:right w:val="single" w:sz="6" w:color="D9D9DE"/>
-              <w:insideH w:val="single" w:sz="6" w:color="D9D9DE"/>
-              <w:insideV w:val="single" w:sz="6" w:color="D9D9DE"/>
-            </w:tcBorders>
-            <w:tcMar>
-              <w:top w:w="75" w:type="dxa"/>
-              <w:start w:w="120" w:type="dxa"/>
-              <w:bottom w:w="75" w:type="dxa"/>
-              <w:end w:w="120" w:type="dxa"/>
-            </w:tcMar>
-            <w:shd w:fill="F5F5F6"/>
-          </w:tcPr>
-          <w:p>
-            <w:pPr>
-              <w:jc w:val="left"/>
-            </w:pPr>
-            <w:r>
-              <w:rPr>
-                <w:rFonts w:ascii="Arial" w:hAnsi="Arial" w:eastAsia="Arial"/>
-                <w:b w:val="0"/>
-                <w:color w:val="111111"/>
-                <w:sz w:val="20"/>
-              </w:rPr>
-              <w:t>Роль тренажёра и математики</w:t>
-            </w:r>
-          </w:p>
-        </w:tc>
-      </w:tr>
-      <w:tr>
-        <w:trPr>
-          <w:cantSplit/>
-        </w:trPr>
-        <w:tc>
-          <w:tcPr>
-            <w:tcW w:type="dxa" w:w="893"/>
-            <w:vAlign w:val="center"/>
-            <w:tcBorders>
-              <w:top w:val="single" w:sz="6" w:color="D9D9DE"/>
-              <w:left w:val="single" w:sz="6" w:color="D9D9DE"/>
-              <w:bottom w:val="single" w:sz="6" w:color="D9D9DE"/>
-              <w:right w:val="single" w:sz="6" w:color="D9D9DE"/>
-              <w:insideH w:val="single" w:sz="6" w:color="D9D9DE"/>
-              <w:insideV w:val="single" w:sz="6" w:color="D9D9DE"/>
-            </w:tcBorders>
-            <w:tcMar>
-              <w:top w:w="75" w:type="dxa"/>
-              <w:start w:w="120" w:type="dxa"/>
-              <w:bottom w:w="75" w:type="dxa"/>
-              <w:end w:w="120" w:type="dxa"/>
-            </w:tcMar>
-          </w:tcPr>
-          <w:p>
-            <w:pPr>
-              <w:jc w:val="center"/>
-            </w:pPr>
-            <w:r>
-              <w:rPr>
-                <w:rFonts w:ascii="Arial" w:hAnsi="Arial" w:eastAsia="Arial"/>
-                <w:b/>
-                <w:color w:val="111111"/>
-                <w:sz w:val="20"/>
-              </w:rPr>
-              <w:t>5</w:t>
-            </w:r>
-          </w:p>
-        </w:tc>
-        <w:tc>
-          <w:tcPr>
-            <w:tcW w:type="dxa" w:w="1843"/>
-            <w:vAlign w:val="center"/>
-            <w:tcBorders>
-              <w:top w:val="single" w:sz="6" w:color="D9D9DE"/>
-              <w:left w:val="single" w:sz="6" w:color="D9D9DE"/>
-              <w:bottom w:val="single" w:sz="6" w:color="D9D9DE"/>
-              <w:right w:val="single" w:sz="6" w:color="D9D9DE"/>
-              <w:insideH w:val="single" w:sz="6" w:color="D9D9DE"/>
-              <w:insideV w:val="single" w:sz="6" w:color="D9D9DE"/>
-            </w:tcBorders>
-            <w:tcMar>
-              <w:top w:w="75" w:type="dxa"/>
-              <w:start w:w="120" w:type="dxa"/>
-              <w:bottom w:w="75" w:type="dxa"/>
-              <w:end w:w="120" w:type="dxa"/>
-            </w:tcMar>
-          </w:tcPr>
-          <w:p>
-            <w:pPr>
-              <w:jc w:val="center"/>
-            </w:pPr>
-            <w:r>
-              <w:rPr>
-                <w:rFonts w:ascii="Arial" w:hAnsi="Arial" w:eastAsia="Arial"/>
-                <w:b w:val="0"/>
-                <w:color w:val="111111"/>
-                <w:sz w:val="20"/>
-              </w:rPr>
-              <w:t>1:27-2:02</w:t>
-            </w:r>
-          </w:p>
-        </w:tc>
-        <w:tc>
-          <w:tcPr>
-            <w:tcW w:type="dxa" w:w="7200"/>
-            <w:vAlign w:val="center"/>
-            <w:tcBorders>
-              <w:top w:val="single" w:sz="6" w:color="D9D9DE"/>
-              <w:left w:val="single" w:sz="6" w:color="D9D9DE"/>
-              <w:bottom w:val="single" w:sz="6" w:color="D9D9DE"/>
-              <w:right w:val="single" w:sz="6" w:color="D9D9DE"/>
-              <w:insideH w:val="single" w:sz="6" w:color="D9D9DE"/>
-              <w:insideV w:val="single" w:sz="6" w:color="D9D9DE"/>
-            </w:tcBorders>
-            <w:tcMar>
-              <w:top w:w="75" w:type="dxa"/>
-              <w:start w:w="120" w:type="dxa"/>
-              <w:bottom w:w="75" w:type="dxa"/>
-              <w:end w:w="120" w:type="dxa"/>
-            </w:tcMar>
-          </w:tcPr>
-          <w:p>
-            <w:pPr>
-              <w:jc w:val="left"/>
-            </w:pPr>
-            <w:r>
-              <w:rPr>
-                <w:rFonts w:ascii="Arial" w:hAnsi="Arial" w:eastAsia="Arial"/>
-                <w:b w:val="0"/>
-                <w:color w:val="111111"/>
-                <w:sz w:val="20"/>
-              </w:rPr>
-              <w:t>Пять спринтов</w:t>
-            </w:r>
-          </w:p>
-        </w:tc>
-      </w:tr>
-      <w:tr>
-        <w:trPr>
-          <w:cantSplit/>
-        </w:trPr>
-        <w:tc>
-          <w:tcPr>
-            <w:tcW w:type="dxa" w:w="893"/>
-            <w:vAlign w:val="center"/>
-            <w:tcBorders>
-              <w:top w:val="single" w:sz="6" w:color="D9D9DE"/>
-              <w:left w:val="single" w:sz="6" w:color="D9D9DE"/>
-              <w:bottom w:val="single" w:sz="6" w:color="D9D9DE"/>
-              <w:right w:val="single" w:sz="6" w:color="D9D9DE"/>
-              <w:insideH w:val="single" w:sz="6" w:color="D9D9DE"/>
-              <w:insideV w:val="single" w:sz="6" w:color="D9D9DE"/>
-            </w:tcBorders>
-            <w:tcMar>
-              <w:top w:w="75" w:type="dxa"/>
-              <w:start w:w="120" w:type="dxa"/>
-              <w:bottom w:w="75" w:type="dxa"/>
-              <w:end w:w="120" w:type="dxa"/>
-            </w:tcMar>
-            <w:shd w:fill="F5F5F6"/>
-          </w:tcPr>
-          <w:p>
-            <w:pPr>
-              <w:jc w:val="center"/>
-            </w:pPr>
-            <w:r>
-              <w:rPr>
-                <w:rFonts w:ascii="Arial" w:hAnsi="Arial" w:eastAsia="Arial"/>
-                <w:b/>
-                <w:color w:val="111111"/>
-                <w:sz w:val="20"/>
-              </w:rPr>
-              <w:t>6</w:t>
-            </w:r>
-          </w:p>
-        </w:tc>
-        <w:tc>
-          <w:tcPr>
-            <w:tcW w:type="dxa" w:w="1843"/>
-            <w:vAlign w:val="center"/>
-            <w:tcBorders>
-              <w:top w:val="single" w:sz="6" w:color="D9D9DE"/>
-              <w:left w:val="single" w:sz="6" w:color="D9D9DE"/>
-              <w:bottom w:val="single" w:sz="6" w:color="D9D9DE"/>
-              <w:right w:val="single" w:sz="6" w:color="D9D9DE"/>
-              <w:insideH w:val="single" w:sz="6" w:color="D9D9DE"/>
-              <w:insideV w:val="single" w:sz="6" w:color="D9D9DE"/>
-            </w:tcBorders>
-            <w:tcMar>
-              <w:top w:w="75" w:type="dxa"/>
-              <w:start w:w="120" w:type="dxa"/>
-              <w:bottom w:w="75" w:type="dxa"/>
-              <w:end w:w="120" w:type="dxa"/>
-            </w:tcMar>
-            <w:shd w:fill="F5F5F6"/>
-          </w:tcPr>
-          <w:p>
-            <w:pPr>
-              <w:jc w:val="center"/>
-            </w:pPr>
-            <w:r>
-              <w:rPr>
-                <w:rFonts w:ascii="Arial" w:hAnsi="Arial" w:eastAsia="Arial"/>
-                <w:b w:val="0"/>
-                <w:color w:val="111111"/>
-                <w:sz w:val="20"/>
-              </w:rPr>
-              <w:t>2:02-2:34</w:t>
-            </w:r>
-          </w:p>
-        </w:tc>
-        <w:tc>
-          <w:tcPr>
-            <w:tcW w:type="dxa" w:w="7200"/>
-            <w:vAlign w:val="center"/>
-            <w:tcBorders>
-              <w:top w:val="single" w:sz="6" w:color="D9D9DE"/>
-              <w:left w:val="single" w:sz="6" w:color="D9D9DE"/>
-              <w:bottom w:val="single" w:sz="6" w:color="D9D9DE"/>
-              <w:right w:val="single" w:sz="6" w:color="D9D9DE"/>
-              <w:insideH w:val="single" w:sz="6" w:color="D9D9DE"/>
-              <w:insideV w:val="single" w:sz="6" w:color="D9D9DE"/>
-            </w:tcBorders>
-            <w:tcMar>
-              <w:top w:w="75" w:type="dxa"/>
-              <w:start w:w="120" w:type="dxa"/>
-              <w:bottom w:w="75" w:type="dxa"/>
-              <w:end w:w="120" w:type="dxa"/>
-            </w:tcMar>
-            <w:shd w:fill="F5F5F6"/>
-          </w:tcPr>
-          <w:p>
-            <w:pPr>
-              <w:jc w:val="left"/>
-            </w:pPr>
-            <w:r>
-              <w:rPr>
-                <w:rFonts w:ascii="Arial" w:hAnsi="Arial" w:eastAsia="Arial"/>
-                <w:b w:val="0"/>
-                <w:color w:val="111111"/>
-                <w:sz w:val="20"/>
-              </w:rPr>
-              <w:t>Продукт и короткий показ тренажёра</w:t>
-            </w:r>
-          </w:p>
-        </w:tc>
-      </w:tr>
-      <w:tr>
-        <w:trPr>
-          <w:cantSplit/>
-        </w:trPr>
-        <w:tc>
-          <w:tcPr>
-            <w:tcW w:type="dxa" w:w="893"/>
-            <w:vAlign w:val="center"/>
-            <w:tcBorders>
-              <w:top w:val="single" w:sz="6" w:color="D9D9DE"/>
-              <w:left w:val="single" w:sz="6" w:color="D9D9DE"/>
-              <w:bottom w:val="single" w:sz="6" w:color="D9D9DE"/>
-              <w:right w:val="single" w:sz="6" w:color="D9D9DE"/>
-              <w:insideH w:val="single" w:sz="6" w:color="D9D9DE"/>
-              <w:insideV w:val="single" w:sz="6" w:color="D9D9DE"/>
-            </w:tcBorders>
-            <w:tcMar>
-              <w:top w:w="75" w:type="dxa"/>
-              <w:start w:w="120" w:type="dxa"/>
-              <w:bottom w:w="75" w:type="dxa"/>
-              <w:end w:w="120" w:type="dxa"/>
-            </w:tcMar>
-          </w:tcPr>
-          <w:p>
-            <w:pPr>
-              <w:jc w:val="center"/>
-            </w:pPr>
-            <w:r>
-              <w:rPr>
-                <w:rFonts w:ascii="Arial" w:hAnsi="Arial" w:eastAsia="Arial"/>
-                <w:b/>
-                <w:color w:val="111111"/>
-                <w:sz w:val="20"/>
-              </w:rPr>
-              <w:t>7</w:t>
-            </w:r>
-          </w:p>
-        </w:tc>
-        <w:tc>
-          <w:tcPr>
-            <w:tcW w:type="dxa" w:w="1843"/>
-            <w:vAlign w:val="center"/>
-            <w:tcBorders>
-              <w:top w:val="single" w:sz="6" w:color="D9D9DE"/>
-              <w:left w:val="single" w:sz="6" w:color="D9D9DE"/>
-              <w:bottom w:val="single" w:sz="6" w:color="D9D9DE"/>
-              <w:right w:val="single" w:sz="6" w:color="D9D9DE"/>
-              <w:insideH w:val="single" w:sz="6" w:color="D9D9DE"/>
-              <w:insideV w:val="single" w:sz="6" w:color="D9D9DE"/>
-            </w:tcBorders>
-            <w:tcMar>
-              <w:top w:w="75" w:type="dxa"/>
-              <w:start w:w="120" w:type="dxa"/>
-              <w:bottom w:w="75" w:type="dxa"/>
-              <w:end w:w="120" w:type="dxa"/>
-            </w:tcMar>
-          </w:tcPr>
-          <w:p>
-            <w:pPr>
-              <w:jc w:val="center"/>
-            </w:pPr>
-            <w:r>
-              <w:rPr>
-                <w:rFonts w:ascii="Arial" w:hAnsi="Arial" w:eastAsia="Arial"/>
-                <w:b w:val="0"/>
-                <w:color w:val="111111"/>
-                <w:sz w:val="20"/>
-              </w:rPr>
-              <w:t>2:34-2:58</w:t>
-            </w:r>
-          </w:p>
-        </w:tc>
-        <w:tc>
-          <w:tcPr>
-            <w:tcW w:type="dxa" w:w="7200"/>
-            <w:vAlign w:val="center"/>
-            <w:tcBorders>
-              <w:top w:val="single" w:sz="6" w:color="D9D9DE"/>
-              <w:left w:val="single" w:sz="6" w:color="D9D9DE"/>
-              <w:bottom w:val="single" w:sz="6" w:color="D9D9DE"/>
-              <w:right w:val="single" w:sz="6" w:color="D9D9DE"/>
-              <w:insideH w:val="single" w:sz="6" w:color="D9D9DE"/>
-              <w:insideV w:val="single" w:sz="6" w:color="D9D9DE"/>
-            </w:tcBorders>
-            <w:tcMar>
-              <w:top w:w="75" w:type="dxa"/>
-              <w:start w:w="120" w:type="dxa"/>
-              <w:bottom w:w="75" w:type="dxa"/>
-              <w:end w:w="120" w:type="dxa"/>
-            </w:tcMar>
-          </w:tcPr>
-          <w:p>
-            <w:pPr>
-              <w:jc w:val="left"/>
-            </w:pPr>
-            <w:r>
-              <w:rPr>
-                <w:rFonts w:ascii="Arial" w:hAnsi="Arial" w:eastAsia="Arial"/>
-                <w:b w:val="0"/>
-                <w:color w:val="111111"/>
-                <w:sz w:val="20"/>
-              </w:rPr>
-              <w:t>Целевые показатели и доказательства</w:t>
-            </w:r>
-          </w:p>
-        </w:tc>
-      </w:tr>
-      <w:tr>
-        <w:trPr>
-          <w:cantSplit/>
-        </w:trPr>
-        <w:tc>
-          <w:tcPr>
-            <w:tcW w:type="dxa" w:w="893"/>
-            <w:vAlign w:val="center"/>
-            <w:tcBorders>
-              <w:top w:val="single" w:sz="6" w:color="D9D9DE"/>
-              <w:left w:val="single" w:sz="6" w:color="D9D9DE"/>
-              <w:bottom w:val="single" w:sz="6" w:color="D9D9DE"/>
-              <w:right w:val="single" w:sz="6" w:color="D9D9DE"/>
-              <w:insideH w:val="single" w:sz="6" w:color="D9D9DE"/>
-              <w:insideV w:val="single" w:sz="6" w:color="D9D9DE"/>
-            </w:tcBorders>
-            <w:tcMar>
-              <w:top w:w="75" w:type="dxa"/>
-              <w:start w:w="120" w:type="dxa"/>
-              <w:bottom w:w="75" w:type="dxa"/>
-              <w:end w:w="120" w:type="dxa"/>
-            </w:tcMar>
-            <w:shd w:fill="F5F5F6"/>
-          </w:tcPr>
-          <w:p>
-            <w:pPr>
-              <w:jc w:val="center"/>
-            </w:pPr>
-            <w:r>
-              <w:rPr>
-                <w:rFonts w:ascii="Arial" w:hAnsi="Arial" w:eastAsia="Arial"/>
-                <w:b/>
-                <w:color w:val="111111"/>
-                <w:sz w:val="20"/>
-              </w:rPr>
-              <w:t>8</w:t>
-            </w:r>
-          </w:p>
-        </w:tc>
-        <w:tc>
-          <w:tcPr>
-            <w:tcW w:type="dxa" w:w="1843"/>
-            <w:vAlign w:val="center"/>
-            <w:tcBorders>
-              <w:top w:val="single" w:sz="6" w:color="D9D9DE"/>
-              <w:left w:val="single" w:sz="6" w:color="D9D9DE"/>
-              <w:bottom w:val="single" w:sz="6" w:color="D9D9DE"/>
-              <w:right w:val="single" w:sz="6" w:color="D9D9DE"/>
-              <w:insideH w:val="single" w:sz="6" w:color="D9D9DE"/>
-              <w:insideV w:val="single" w:sz="6" w:color="D9D9DE"/>
-            </w:tcBorders>
-            <w:tcMar>
-              <w:top w:w="75" w:type="dxa"/>
-              <w:start w:w="120" w:type="dxa"/>
-              <w:bottom w:w="75" w:type="dxa"/>
-              <w:end w:w="120" w:type="dxa"/>
-            </w:tcMar>
-            <w:shd w:fill="F5F5F6"/>
-          </w:tcPr>
-          <w:p>
-            <w:pPr>
-              <w:jc w:val="center"/>
-            </w:pPr>
-            <w:r>
-              <w:rPr>
-                <w:rFonts w:ascii="Arial" w:hAnsi="Arial" w:eastAsia="Arial"/>
-                <w:b w:val="0"/>
-                <w:color w:val="111111"/>
-                <w:sz w:val="20"/>
-              </w:rPr>
-              <w:t>2:58-3:20</w:t>
-            </w:r>
-          </w:p>
-        </w:tc>
-        <w:tc>
-          <w:tcPr>
-            <w:tcW w:type="dxa" w:w="7200"/>
-            <w:vAlign w:val="center"/>
-            <w:tcBorders>
-              <w:top w:val="single" w:sz="6" w:color="D9D9DE"/>
-              <w:left w:val="single" w:sz="6" w:color="D9D9DE"/>
-              <w:bottom w:val="single" w:sz="6" w:color="D9D9DE"/>
-              <w:right w:val="single" w:sz="6" w:color="D9D9DE"/>
-              <w:insideH w:val="single" w:sz="6" w:color="D9D9DE"/>
-              <w:insideV w:val="single" w:sz="6" w:color="D9D9DE"/>
-            </w:tcBorders>
-            <w:tcMar>
-              <w:top w:w="75" w:type="dxa"/>
-              <w:start w:w="120" w:type="dxa"/>
-              <w:bottom w:w="75" w:type="dxa"/>
-              <w:end w:w="120" w:type="dxa"/>
-            </w:tcMar>
-            <w:shd w:fill="F5F5F6"/>
-          </w:tcPr>
-          <w:p>
-            <w:pPr>
-              <w:jc w:val="left"/>
-            </w:pPr>
-            <w:r>
-              <w:rPr>
-                <w:rFonts w:ascii="Arial" w:hAnsi="Arial" w:eastAsia="Arial"/>
-                <w:b w:val="0"/>
-                <w:color w:val="111111"/>
-                <w:sz w:val="20"/>
-              </w:rPr>
-              <w:t>Комплект учителя и резервные решения</w:t>
-            </w:r>
-          </w:p>
-        </w:tc>
-      </w:tr>
-      <w:tr>
-        <w:trPr>
-          <w:cantSplit/>
-        </w:trPr>
-        <w:tc>
-          <w:tcPr>
-            <w:tcW w:type="dxa" w:w="893"/>
-            <w:vAlign w:val="center"/>
-            <w:tcBorders>
-              <w:top w:val="single" w:sz="6" w:color="D9D9DE"/>
-              <w:left w:val="single" w:sz="6" w:color="D9D9DE"/>
-              <w:bottom w:val="single" w:sz="6" w:color="D9D9DE"/>
-              <w:right w:val="single" w:sz="6" w:color="D9D9DE"/>
-              <w:insideH w:val="single" w:sz="6" w:color="D9D9DE"/>
-              <w:insideV w:val="single" w:sz="6" w:color="D9D9DE"/>
-            </w:tcBorders>
-            <w:tcMar>
-              <w:top w:w="75" w:type="dxa"/>
-              <w:start w:w="120" w:type="dxa"/>
-              <w:bottom w:w="75" w:type="dxa"/>
-              <w:end w:w="120" w:type="dxa"/>
-            </w:tcMar>
-          </w:tcPr>
-          <w:p>
-            <w:pPr>
-              <w:jc w:val="center"/>
-            </w:pPr>
-            <w:r>
-              <w:rPr>
-                <w:rFonts w:ascii="Arial" w:hAnsi="Arial" w:eastAsia="Arial"/>
-                <w:b/>
-                <w:color w:val="111111"/>
-                <w:sz w:val="20"/>
-              </w:rPr>
-              <w:t>9</w:t>
-            </w:r>
-          </w:p>
-        </w:tc>
-        <w:tc>
-          <w:tcPr>
-            <w:tcW w:type="dxa" w:w="1843"/>
-            <w:vAlign w:val="center"/>
-            <w:tcBorders>
-              <w:top w:val="single" w:sz="6" w:color="D9D9DE"/>
-              <w:left w:val="single" w:sz="6" w:color="D9D9DE"/>
-              <w:bottom w:val="single" w:sz="6" w:color="D9D9DE"/>
-              <w:right w:val="single" w:sz="6" w:color="D9D9DE"/>
-              <w:insideH w:val="single" w:sz="6" w:color="D9D9DE"/>
-              <w:insideV w:val="single" w:sz="6" w:color="D9D9DE"/>
-            </w:tcBorders>
-            <w:tcMar>
-              <w:top w:w="75" w:type="dxa"/>
-              <w:start w:w="120" w:type="dxa"/>
-              <w:bottom w:w="75" w:type="dxa"/>
-              <w:end w:w="120" w:type="dxa"/>
-            </w:tcMar>
-          </w:tcPr>
-          <w:p>
-            <w:pPr>
-              <w:jc w:val="center"/>
-            </w:pPr>
-            <w:r>
-              <w:rPr>
-                <w:rFonts w:ascii="Arial" w:hAnsi="Arial" w:eastAsia="Arial"/>
-                <w:b w:val="0"/>
-                <w:color w:val="111111"/>
-                <w:sz w:val="20"/>
-              </w:rPr>
-              <w:t>3:20-3:28</w:t>
-            </w:r>
-          </w:p>
-        </w:tc>
-        <w:tc>
-          <w:tcPr>
-            <w:tcW w:type="dxa" w:w="7200"/>
-            <w:vAlign w:val="center"/>
-            <w:tcBorders>
-              <w:top w:val="single" w:sz="6" w:color="D9D9DE"/>
-              <w:left w:val="single" w:sz="6" w:color="D9D9DE"/>
-              <w:bottom w:val="single" w:sz="6" w:color="D9D9DE"/>
-              <w:right w:val="single" w:sz="6" w:color="D9D9DE"/>
-              <w:insideH w:val="single" w:sz="6" w:color="D9D9DE"/>
-              <w:insideV w:val="single" w:sz="6" w:color="D9D9DE"/>
-            </w:tcBorders>
-            <w:tcMar>
-              <w:top w:w="75" w:type="dxa"/>
-              <w:start w:w="120" w:type="dxa"/>
-              <w:bottom w:w="75" w:type="dxa"/>
-              <w:end w:w="120" w:type="dxa"/>
-            </w:tcMar>
-          </w:tcPr>
-          <w:p>
-            <w:pPr>
-              <w:jc w:val="left"/>
-            </w:pPr>
-            <w:r>
-              <w:rPr>
-                <w:rFonts w:ascii="Arial" w:hAnsi="Arial" w:eastAsia="Arial"/>
-                <w:b w:val="0"/>
-                <w:color w:val="111111"/>
-                <w:sz w:val="20"/>
-              </w:rPr>
-              <w:t>Вывод и переход к вопросам</w:t>
-            </w:r>
-          </w:p>
-        </w:tc>
-      </w:tr>
-    </w:tbl>
-    <w:p>
-      <w:pPr>
-        <w:spacing w:after="0" w:line="259" w:lineRule="auto"/>
-      </w:pPr>
-      <w:r>
-        <w:rPr>
-          <w:rFonts w:ascii="Arial" w:hAnsi="Arial" w:eastAsia="Arial"/>
-          <w:b/>
-          <w:color w:val="111111"/>
-          <w:sz w:val="23"/>
-        </w:rPr>
-        <w:t xml:space="preserve">Ориентиры. </w:t>
-      </w:r>
-      <w:r>
-        <w:rPr>
-          <w:rFonts w:ascii="Arial" w:hAnsi="Arial" w:eastAsia="Arial"/>
-          <w:b w:val="0"/>
-          <w:color w:val="111111"/>
-          <w:sz w:val="23"/>
-        </w:rPr>
-        <w:t>Контрольные отметки: к 1:27 должен открыться слайд 5, к 2:34 слайд 7, к 3:20 слайд 9. Если опоздание превышает 10 секунд, используйте сокращения из раздела ниже.</w:t>
-      </w:r>
-    </w:p>
-    <w:p>
-      <w:r>
-        <w:br w:type="page"/>
-      </w:r>
-    </w:p>
-    <w:p>
-      <w:pPr>
-        <w:pStyle w:val="Heading1"/>
-      </w:pPr>
-      <w:r>
-        <w:rPr>
-          <w:rFonts w:ascii="Arial" w:hAnsi="Arial" w:eastAsia="Arial"/>
-          <w:b/>
-          <w:color w:val="111111"/>
-          <w:sz w:val="34"/>
-        </w:rPr>
-        <w:t>Основной сценарий 3 минуты 28 секунд</w:t>
-      </w:r>
-    </w:p>
-    <w:p>
-      <w:pPr>
-        <w:pStyle w:val="Heading2"/>
-        <w:keepNext/>
-        <w:spacing w:before="180" w:after="40"/>
-      </w:pPr>
-      <w:r>
-        <w:rPr>
-          <w:rFonts w:ascii="Arial" w:hAnsi="Arial" w:eastAsia="Arial"/>
-          <w:b/>
-          <w:color w:val="111111"/>
-          <w:sz w:val="27"/>
-        </w:rPr>
-        <w:t>Слайд 1 Титул</w:t>
-      </w:r>
-    </w:p>
-    <w:p>
-      <w:pPr>
-        <w:keepNext/>
-        <w:spacing w:after="60"/>
-      </w:pPr>
-      <w:r>
-        <w:rPr>
-          <w:rFonts w:ascii="Arial" w:hAnsi="Arial" w:eastAsia="Arial"/>
-          <w:b/>
-          <w:color w:val="7ACB3A"/>
-          <w:sz w:val="21"/>
-        </w:rPr>
-        <w:t>0:00-0:12</w:t>
-      </w:r>
-    </w:p>
-    <w:p>
-      <w:pPr>
-        <w:spacing w:after="100" w:line="259" w:lineRule="auto"/>
-      </w:pPr>
-      <w:r>
-        <w:rPr>
-          <w:rFonts w:ascii="Arial" w:hAnsi="Arial" w:eastAsia="Arial"/>
-          <w:b w:val="0"/>
-          <w:color w:val="111111"/>
-          <w:sz w:val="22"/>
-        </w:rPr>
-        <w:t>Добрый день. Представляю методическую разработку «Тьюринг под лупой» для подготовки одиннадцатиклассников к заданию 12 КЕГЭ.</w:t>
-      </w:r>
-    </w:p>
-    <w:p>
-      <w:pPr>
-        <w:pStyle w:val="Heading2"/>
-        <w:keepNext/>
-        <w:spacing w:before="180" w:after="40"/>
-      </w:pPr>
-      <w:r>
-        <w:rPr>
-          <w:rFonts w:ascii="Arial" w:hAnsi="Arial" w:eastAsia="Arial"/>
-          <w:b/>
-          <w:color w:val="111111"/>
-          <w:sz w:val="27"/>
-        </w:rPr>
-        <w:t>Слайд 2 Занятие в одном кадре</w:t>
-      </w:r>
-    </w:p>
-    <w:p>
-      <w:pPr>
-        <w:keepNext/>
-        <w:spacing w:after="60"/>
-      </w:pPr>
-      <w:r>
-        <w:rPr>
-          <w:rFonts w:ascii="Arial" w:hAnsi="Arial" w:eastAsia="Arial"/>
-          <w:b/>
-          <w:color w:val="7ACB3A"/>
-          <w:sz w:val="21"/>
-        </w:rPr>
-        <w:t>0:12-0:32</w:t>
-      </w:r>
-    </w:p>
-    <w:p>
-      <w:pPr>
-        <w:spacing w:after="100" w:line="259" w:lineRule="auto"/>
-      </w:pPr>
-      <w:r>
-        <w:rPr>
-          <w:rFonts w:ascii="Arial" w:hAnsi="Arial" w:eastAsia="Arial"/>
-          <w:b w:val="0"/>
-          <w:color w:val="111111"/>
-          <w:sz w:val="22"/>
-        </w:rPr>
-        <w:t>Это два урока по 45 минут на стыке информатики и математики. Итогом становится диагностический маршрут. По нему другой ученик выбирает способ решения новой задачи без устных пояснений авторов.</w:t>
-      </w:r>
-    </w:p>
-    <w:p>
-      <w:pPr>
-        <w:pStyle w:val="Heading2"/>
-        <w:keepNext/>
-        <w:spacing w:before="180" w:after="40"/>
-      </w:pPr>
-      <w:r>
-        <w:rPr>
-          <w:rFonts w:ascii="Arial" w:hAnsi="Arial" w:eastAsia="Arial"/>
-          <w:b/>
-          <w:color w:val="111111"/>
-          <w:sz w:val="27"/>
-        </w:rPr>
-        <w:t>Слайд 3 Проблема</w:t>
-      </w:r>
-    </w:p>
-    <w:p>
-      <w:pPr>
-        <w:keepNext/>
-        <w:spacing w:after="60"/>
-      </w:pPr>
-      <w:r>
-        <w:rPr>
-          <w:rFonts w:ascii="Arial" w:hAnsi="Arial" w:eastAsia="Arial"/>
-          <w:b/>
-          <w:color w:val="7ACB3A"/>
-          <w:sz w:val="21"/>
-        </w:rPr>
-        <w:t>0:32-1:00</w:t>
-      </w:r>
-    </w:p>
-    <w:p>
-      <w:pPr>
-        <w:spacing w:after="100" w:line="259" w:lineRule="auto"/>
-      </w:pPr>
-      <w:r>
-        <w:rPr>
-          <w:rFonts w:ascii="Arial" w:hAnsi="Arial" w:eastAsia="Arial"/>
-          <w:b w:val="0"/>
-          <w:color w:val="111111"/>
-          <w:sz w:val="22"/>
-        </w:rPr>
-        <w:t>Проблема возникает, когда полная трассировка превращается из учебной опоры в единственный способ решения. На длинной ленте ученик тратит время и накапливает ошибки. По одному ответу учителю трудно понять, увидел ли ученик закономерность. Поэтому занятие учит осознанно выбирать стратегию.</w:t>
-      </w:r>
-    </w:p>
-    <w:p>
-      <w:pPr>
-        <w:pStyle w:val="Heading2"/>
-        <w:keepNext/>
-        <w:spacing w:before="180" w:after="40"/>
-      </w:pPr>
-      <w:r>
-        <w:rPr>
-          <w:rFonts w:ascii="Arial" w:hAnsi="Arial" w:eastAsia="Arial"/>
-          <w:b/>
-          <w:color w:val="111111"/>
-          <w:sz w:val="27"/>
-        </w:rPr>
-        <w:t>Слайд 4 Замысел занятия</w:t>
-      </w:r>
-    </w:p>
-    <w:p>
-      <w:pPr>
-        <w:keepNext/>
-        <w:spacing w:after="60"/>
-      </w:pPr>
-      <w:r>
-        <w:rPr>
-          <w:rFonts w:ascii="Arial" w:hAnsi="Arial" w:eastAsia="Arial"/>
-          <w:b/>
-          <w:color w:val="7ACB3A"/>
-          <w:sz w:val="21"/>
-        </w:rPr>
-        <w:t>1:00-1:27</w:t>
-      </w:r>
-    </w:p>
-    <w:p>
-      <w:pPr>
-        <w:spacing w:after="100" w:line="259" w:lineRule="auto"/>
-      </w:pPr>
-      <w:r>
-        <w:rPr>
-          <w:rFonts w:ascii="Arial" w:hAnsi="Arial" w:eastAsia="Arial"/>
-          <w:b w:val="0"/>
-          <w:color w:val="111111"/>
-          <w:sz w:val="22"/>
-        </w:rPr>
-        <w:t>Тренажёр здесь работает как исследовательский стенд. Ученики наблюдают отдельные шаги, сравнивают попытки, находят цикл или инвариант. Затем они проверяют правило на обычном и граничном примерах и решают, нужна ли полная трассировка, короткая проверка или аналитический вывод.</w:t>
-      </w:r>
-    </w:p>
-    <w:p>
-      <w:pPr>
-        <w:pStyle w:val="Heading2"/>
-        <w:keepNext/>
-        <w:spacing w:before="180" w:after="40"/>
-      </w:pPr>
-      <w:r>
-        <w:rPr>
-          <w:rFonts w:ascii="Arial" w:hAnsi="Arial" w:eastAsia="Arial"/>
-          <w:b/>
-          <w:color w:val="111111"/>
-          <w:sz w:val="27"/>
-        </w:rPr>
-        <w:t>Слайд 5 Пять спринтов</w:t>
-      </w:r>
-    </w:p>
-    <w:p>
-      <w:pPr>
-        <w:keepNext/>
-        <w:spacing w:after="60"/>
-      </w:pPr>
-      <w:r>
-        <w:rPr>
-          <w:rFonts w:ascii="Arial" w:hAnsi="Arial" w:eastAsia="Arial"/>
-          <w:b/>
-          <w:color w:val="7ACB3A"/>
-          <w:sz w:val="21"/>
-        </w:rPr>
-        <w:t>1:27-2:02</w:t>
-      </w:r>
-    </w:p>
-    <w:p>
-      <w:pPr>
-        <w:spacing w:after="100" w:line="259" w:lineRule="auto"/>
-      </w:pPr>
-      <w:r>
-        <w:rPr>
-          <w:rFonts w:ascii="Arial" w:hAnsi="Arial" w:eastAsia="Arial"/>
-          <w:b w:val="0"/>
-          <w:color w:val="111111"/>
-          <w:sz w:val="22"/>
-        </w:rPr>
-        <w:t>Работа разбита на пять спринтов. Сначала ученик фиксирует исходную стратегию. Затем команда собирает данные трёх попыток и формулирует закономерность. На втором уроке она собирает маршрут и передаёт его другой команде без пояснений. Проверка показывает, действительно ли продукт понятен пользователю.</w:t>
-      </w:r>
-    </w:p>
-    <w:p>
-      <w:pPr>
-        <w:pStyle w:val="Heading2"/>
-        <w:keepNext/>
-        <w:spacing w:before="180" w:after="40"/>
-      </w:pPr>
-      <w:r>
-        <w:rPr>
-          <w:rFonts w:ascii="Arial" w:hAnsi="Arial" w:eastAsia="Arial"/>
-          <w:b/>
-          <w:color w:val="111111"/>
-          <w:sz w:val="27"/>
-        </w:rPr>
-        <w:t>Слайд 6 Продукт и тренажёр</w:t>
-      </w:r>
-    </w:p>
-    <w:p>
-      <w:pPr>
-        <w:keepNext/>
-        <w:spacing w:after="60"/>
-      </w:pPr>
-      <w:r>
-        <w:rPr>
-          <w:rFonts w:ascii="Arial" w:hAnsi="Arial" w:eastAsia="Arial"/>
-          <w:b/>
-          <w:color w:val="7ACB3A"/>
-          <w:sz w:val="21"/>
-        </w:rPr>
-        <w:t>2:02-2:34</w:t>
-      </w:r>
-    </w:p>
-    <w:p>
-      <w:pPr>
-        <w:spacing w:after="100" w:line="259" w:lineRule="auto"/>
-      </w:pPr>
-      <w:r>
-        <w:rPr>
-          <w:rFonts w:ascii="Arial" w:hAnsi="Arial" w:eastAsia="Arial"/>
-          <w:b w:val="0"/>
-          <w:color w:val="111111"/>
-          <w:sz w:val="22"/>
-        </w:rPr>
-        <w:t>Итоговый продукт содержит правила выбора стратегии, данные трёх попыток, разбор машины, карту ошибок и проверочный пример. На экране видно сам тренажёр: ленту, таблицу команд и пошаговое управление. Для короткой демонстрации достаточно показать один прогноз и один шаг. Полный прогон не нужен.</w:t>
-      </w:r>
-    </w:p>
-    <w:p>
-      <w:pPr>
-        <w:pStyle w:val="Heading2"/>
-        <w:keepNext/>
-        <w:spacing w:before="180" w:after="40"/>
-      </w:pPr>
-      <w:r>
-        <w:rPr>
-          <w:rFonts w:ascii="Arial" w:hAnsi="Arial" w:eastAsia="Arial"/>
-          <w:b/>
-          <w:color w:val="111111"/>
-          <w:sz w:val="27"/>
-        </w:rPr>
-        <w:t>Слайд 7 Как оценим</w:t>
-      </w:r>
-    </w:p>
-    <w:p>
-      <w:pPr>
-        <w:keepNext/>
-        <w:spacing w:after="60"/>
-      </w:pPr>
-      <w:r>
-        <w:rPr>
-          <w:rFonts w:ascii="Arial" w:hAnsi="Arial" w:eastAsia="Arial"/>
-          <w:b/>
-          <w:color w:val="7ACB3A"/>
-          <w:sz w:val="21"/>
-        </w:rPr>
-        <w:t>2:34-2:58</w:t>
-      </w:r>
-    </w:p>
-    <w:p>
-      <w:pPr>
-        <w:spacing w:after="100" w:line="259" w:lineRule="auto"/>
-      </w:pPr>
-      <w:r>
-        <w:rPr>
-          <w:rFonts w:ascii="Arial" w:hAnsi="Arial" w:eastAsia="Arial"/>
-          <w:b w:val="0"/>
-          <w:color w:val="111111"/>
-          <w:sz w:val="22"/>
-        </w:rPr>
-        <w:t>Результат оценивается по входной и итоговой диагностике, данным попыток и независимой проверке продукта. На первый пилот заданы ориентиры: не менее восьмидесяти процентов правильных итоговых решений без подсказок, не менее семидесяти пяти процентов понятных маршрутов и обязательная проверка каждого использованного ответа ИИ. Это плановые показатели, а не уже полученные результаты.</w:t>
-      </w:r>
-    </w:p>
-    <w:p>
-      <w:pPr>
-        <w:pStyle w:val="Heading2"/>
-        <w:keepNext/>
-        <w:spacing w:before="180" w:after="40"/>
-      </w:pPr>
-      <w:r>
-        <w:rPr>
-          <w:rFonts w:ascii="Arial" w:hAnsi="Arial" w:eastAsia="Arial"/>
-          <w:b/>
-          <w:color w:val="111111"/>
-          <w:sz w:val="27"/>
-        </w:rPr>
-        <w:t>Слайд 8 Готовый комплект и внедрение</w:t>
-      </w:r>
-    </w:p>
-    <w:p>
-      <w:pPr>
-        <w:keepNext/>
-        <w:spacing w:after="60"/>
-      </w:pPr>
-      <w:r>
-        <w:rPr>
-          <w:rFonts w:ascii="Arial" w:hAnsi="Arial" w:eastAsia="Arial"/>
-          <w:b/>
-          <w:color w:val="7ACB3A"/>
-          <w:sz w:val="21"/>
-        </w:rPr>
-        <w:t>2:58-3:20</w:t>
-      </w:r>
-    </w:p>
-    <w:p>
-      <w:pPr>
-        <w:spacing w:after="100" w:line="259" w:lineRule="auto"/>
-      </w:pPr>
-      <w:r>
-        <w:rPr>
-          <w:rFonts w:ascii="Arial" w:hAnsi="Arial" w:eastAsia="Arial"/>
-          <w:b w:val="0"/>
-          <w:color w:val="111111"/>
-          <w:sz w:val="22"/>
-        </w:rPr>
-        <w:t>Для учителя подготовлен полный комплект: сценарий, рабочие материалы, КИМы, рубрикатор и автономная версия тренажёра. Если нет сети, используется один HTML-файл. Без компьютеров остаются таблицы команд и подготовленные данные попыток. Если ИИ недоступен, ученики проверяют объяснение с намеренной ошибкой.</w:t>
-      </w:r>
-    </w:p>
-    <w:p>
-      <w:pPr>
-        <w:pStyle w:val="Heading2"/>
-        <w:keepNext/>
-        <w:spacing w:before="180" w:after="40"/>
-      </w:pPr>
-      <w:r>
-        <w:rPr>
-          <w:rFonts w:ascii="Arial" w:hAnsi="Arial" w:eastAsia="Arial"/>
-          <w:b/>
-          <w:color w:val="111111"/>
-          <w:sz w:val="27"/>
-        </w:rPr>
-        <w:t>Слайд 9 Завершение</w:t>
-      </w:r>
-    </w:p>
-    <w:p>
-      <w:pPr>
-        <w:keepNext/>
-        <w:spacing w:after="60"/>
-      </w:pPr>
-      <w:r>
-        <w:rPr>
-          <w:rFonts w:ascii="Arial" w:hAnsi="Arial" w:eastAsia="Arial"/>
-          <w:b/>
-          <w:color w:val="7ACB3A"/>
-          <w:sz w:val="21"/>
-        </w:rPr>
-        <w:t>3:20-3:28</w:t>
-      </w:r>
-    </w:p>
-    <w:p>
-      <w:pPr>
-        <w:spacing w:after="100" w:line="259" w:lineRule="auto"/>
-      </w:pPr>
-      <w:r>
-        <w:rPr>
-          <w:rFonts w:ascii="Arial" w:hAnsi="Arial" w:eastAsia="Arial"/>
-          <w:b w:val="0"/>
-          <w:color w:val="111111"/>
-          <w:sz w:val="22"/>
-        </w:rPr>
-        <w:t>В результате тренажёр встроен в полный сценарий двух уроков и поддерживает переход от механического исполнения к обоснованному выбору стратегии. Спасибо. Готов ответить на вопросы.</w:t>
-      </w:r>
-    </w:p>
-    <w:p>
-      <w:r>
-        <w:br w:type="page"/>
-      </w:r>
-    </w:p>
-    <w:p>
-      <w:pPr>
-        <w:pStyle w:val="Heading1"/>
-      </w:pPr>
-      <w:r>
-        <w:rPr>
-          <w:rFonts w:ascii="Arial" w:hAnsi="Arial" w:eastAsia="Arial"/>
-          <w:b/>
-          <w:color w:val="111111"/>
-          <w:sz w:val="34"/>
-        </w:rPr>
-        <w:t>Резервный сценарий около 3 минут</w:t>
-      </w:r>
-    </w:p>
-    <w:p>
-      <w:pPr>
-        <w:spacing w:after="120" w:line="259" w:lineRule="auto"/>
-      </w:pPr>
-      <w:r>
-        <w:rPr>
-          <w:rFonts w:ascii="Arial" w:hAnsi="Arial" w:eastAsia="Arial"/>
-          <w:b w:val="0"/>
-          <w:color w:val="111111"/>
-          <w:sz w:val="23"/>
-        </w:rPr>
-        <w:t>Добрый день. Представляю методическую разработку «Тьюринг под лупой» для 11 класса. Это два урока по 45 минут на стыке информатики и математики. Ученический продукт представляет собой диагностический маршрут выбора способа решения задания 12 КЕГЭ.</w:t>
-      </w:r>
-    </w:p>
-    <w:p>
-      <w:pPr>
-        <w:spacing w:after="120" w:line="259" w:lineRule="auto"/>
-      </w:pPr>
-      <w:r>
-        <w:rPr>
-          <w:rFonts w:ascii="Arial" w:hAnsi="Arial" w:eastAsia="Arial"/>
-          <w:b w:val="0"/>
-          <w:color w:val="111111"/>
-          <w:sz w:val="23"/>
-        </w:rPr>
-        <w:t>Проблема состоит в том, что полная трассировка часто становится единственной стратегией. На длинной ленте ученик тратит время, накапливает ошибки, а учитель по одному ответу не видит ход рассуждения.</w:t>
-      </w:r>
-    </w:p>
-    <w:p>
-      <w:pPr>
-        <w:spacing w:after="120" w:line="259" w:lineRule="auto"/>
-      </w:pPr>
-      <w:r>
-        <w:rPr>
-          <w:rFonts w:ascii="Arial" w:hAnsi="Arial" w:eastAsia="Arial"/>
-          <w:b w:val="0"/>
-          <w:color w:val="111111"/>
-          <w:sz w:val="23"/>
-        </w:rPr>
-        <w:t>В нашем занятии тренажёр работает как исследовательский стенд. Ученики выполняют несколько шагов, собирают данные попыток, находят цикл или инвариант и проверяют правило на обычном и граничном примерах. После этого они выбирают полную трассировку, короткую проверку или аналитическое решение.</w:t>
-      </w:r>
-    </w:p>
-    <w:p>
-      <w:pPr>
-        <w:spacing w:after="120" w:line="259" w:lineRule="auto"/>
-      </w:pPr>
-      <w:r>
-        <w:rPr>
-          <w:rFonts w:ascii="Arial" w:hAnsi="Arial" w:eastAsia="Arial"/>
-          <w:b w:val="0"/>
-          <w:color w:val="111111"/>
-          <w:sz w:val="23"/>
-        </w:rPr>
-        <w:t>Занятие включает пять спринтов. Сначала фиксируется исходная стратегия. Затем команда сравнивает три попытки, формулирует закономерность, собирает маршрут и передаёт его другой команде без устных пояснений. Так мы проверяем применимость продукта, а не только его оформление.</w:t>
-      </w:r>
-    </w:p>
-    <w:p>
-      <w:pPr>
-        <w:spacing w:after="120" w:line="259" w:lineRule="auto"/>
-      </w:pPr>
-      <w:r>
-        <w:rPr>
-          <w:rFonts w:ascii="Arial" w:hAnsi="Arial" w:eastAsia="Arial"/>
-          <w:b w:val="0"/>
-          <w:color w:val="111111"/>
-          <w:sz w:val="23"/>
-        </w:rPr>
-        <w:t>Маршрут содержит условия выбора трёх стратегий, данные попыток, разбор машины, карту типичных ошибок и проверочный пример. Использованный ответ ИИ обязательно проверяется в тренажёре и на дополнительном примере.</w:t>
-      </w:r>
-    </w:p>
-    <w:p>
-      <w:pPr>
-        <w:spacing w:after="120" w:line="259" w:lineRule="auto"/>
-      </w:pPr>
-      <w:r>
-        <w:rPr>
-          <w:rFonts w:ascii="Arial" w:hAnsi="Arial" w:eastAsia="Arial"/>
-          <w:b w:val="0"/>
-          <w:color w:val="111111"/>
-          <w:sz w:val="23"/>
-        </w:rPr>
-        <w:t>Для первого проведения заданы целевые показатели. Не менее восьмидесяти процентов учеников должны решить итоговый кейс без подсказок, не менее семидесяти пяти процентов маршрутов должна применить другая команда без пояснений, а каждый использованный ответ ИИ должен быть проверен. Это ориентиры будущего пилота.</w:t>
-      </w:r>
-    </w:p>
-    <w:p>
-      <w:pPr>
-        <w:spacing w:after="120" w:line="259" w:lineRule="auto"/>
-      </w:pPr>
-      <w:r>
-        <w:rPr>
-          <w:rFonts w:ascii="Arial" w:hAnsi="Arial" w:eastAsia="Arial"/>
-          <w:b w:val="0"/>
-          <w:color w:val="111111"/>
-          <w:sz w:val="23"/>
-        </w:rPr>
-        <w:t>Учитель получает сценарий, рабочие материалы, КИМы, рубрикатор и резервные варианты. При отсутствии сети работает автономный HTML-файл, а без компьютеров используются таблицы команд и подготовленные данные попыток. Таким образом, тренажёр включён в воспроизводимый сценарий двух уроков. Спасибо. Готов ответить на вопросы.</w:t>
-      </w:r>
-    </w:p>
-    <w:p>
-      <w:pPr>
-        <w:pStyle w:val="Heading1"/>
-      </w:pPr>
-      <w:r>
-        <w:rPr>
-          <w:rFonts w:ascii="Arial" w:hAnsi="Arial" w:eastAsia="Arial"/>
-          <w:b/>
-          <w:color w:val="111111"/>
-          <w:sz w:val="34"/>
-        </w:rPr>
-        <w:t>Сокращения при отставании</w:t>
-      </w:r>
-    </w:p>
-    <w:p>
-      <w:pPr>
-        <w:pStyle w:val="ListBullet"/>
-        <w:spacing w:after="60"/>
-        <w:ind w:left="360" w:hanging="216"/>
-      </w:pPr>
-      <w:r>
-        <w:rPr>
-          <w:rFonts w:ascii="Arial" w:hAnsi="Arial" w:eastAsia="Arial"/>
-          <w:b w:val="0"/>
-          <w:color w:val="111111"/>
-          <w:sz w:val="22"/>
-        </w:rPr>
-        <w:t>На слайде 2 произнести только первое и последнее предложения.</w:t>
-      </w:r>
-    </w:p>
-    <w:p>
-      <w:pPr>
-        <w:pStyle w:val="ListBullet"/>
-        <w:spacing w:after="60"/>
-        <w:ind w:left="360" w:hanging="216"/>
-      </w:pPr>
-      <w:r>
-        <w:rPr>
-          <w:rFonts w:ascii="Arial" w:hAnsi="Arial" w:eastAsia="Arial"/>
-          <w:b w:val="0"/>
-          <w:color w:val="111111"/>
-          <w:sz w:val="22"/>
-        </w:rPr>
-        <w:t>На слайде 5 назвать пять спринтов без пояснения каждого этапа.</w:t>
-      </w:r>
-    </w:p>
-    <w:p>
-      <w:pPr>
-        <w:pStyle w:val="ListBullet"/>
-        <w:spacing w:after="60"/>
-        <w:ind w:left="360" w:hanging="216"/>
-      </w:pPr>
-      <w:r>
-        <w:rPr>
-          <w:rFonts w:ascii="Arial" w:hAnsi="Arial" w:eastAsia="Arial"/>
-          <w:b w:val="0"/>
-          <w:color w:val="111111"/>
-          <w:sz w:val="22"/>
-        </w:rPr>
-        <w:t>На слайде 7 назвать главный ориентир и подчеркнуть, что значения целевые.</w:t>
-      </w:r>
-    </w:p>
-    <w:p>
-      <w:pPr>
-        <w:pStyle w:val="ListBullet"/>
-        <w:spacing w:after="60"/>
-        <w:ind w:left="360" w:hanging="216"/>
-      </w:pPr>
-      <w:r>
-        <w:rPr>
-          <w:rFonts w:ascii="Arial" w:hAnsi="Arial" w:eastAsia="Arial"/>
-          <w:b w:val="0"/>
-          <w:color w:val="111111"/>
-          <w:sz w:val="22"/>
-        </w:rPr>
-        <w:t>На слайде 8 назвать только автономный HTML и печатную замену.</w:t>
-      </w:r>
-    </w:p>
-    <w:p>
-      <w:pPr>
-        <w:spacing w:after="120" w:line="259" w:lineRule="auto"/>
-      </w:pPr>
-      <w:r>
-        <w:rPr>
-          <w:rFonts w:ascii="Arial" w:hAnsi="Arial" w:eastAsia="Arial"/>
-          <w:b/>
-          <w:color w:val="111111"/>
-          <w:sz w:val="23"/>
-        </w:rPr>
-        <w:t xml:space="preserve">Сохранить обязательно. </w:t>
-      </w:r>
-      <w:r>
-        <w:rPr>
-          <w:rFonts w:ascii="Arial" w:hAnsi="Arial" w:eastAsia="Arial"/>
-          <w:b w:val="0"/>
-          <w:color w:val="111111"/>
-          <w:sz w:val="23"/>
-        </w:rPr>
-        <w:t>Не сокращайте формулировку ученического продукта и предупреждение о плановом характере метрик.</w:t>
-      </w:r>
-    </w:p>
-    <w:p>
-      <w:r>
-        <w:br w:type="page"/>
-      </w:r>
-    </w:p>
-    <w:p>
-      <w:pPr>
-        <w:pStyle w:val="Heading1"/>
-      </w:pPr>
-      <w:r>
-        <w:rPr>
-          <w:rFonts w:ascii="Arial" w:hAnsi="Arial" w:eastAsia="Arial"/>
-          <w:b/>
-          <w:color w:val="111111"/>
-          <w:sz w:val="34"/>
-        </w:rPr>
-        <w:t>Короткая демонстрация 20 секунд</w:t>
-      </w:r>
-    </w:p>
-    <w:p>
-      <w:pPr>
-        <w:spacing w:after="120" w:line="259" w:lineRule="auto"/>
-      </w:pPr>
-      <w:r>
-        <w:rPr>
-          <w:rFonts w:ascii="Arial" w:hAnsi="Arial" w:eastAsia="Arial"/>
-          <w:b w:val="0"/>
-          <w:color w:val="111111"/>
-          <w:sz w:val="23"/>
-        </w:rPr>
-        <w:t>По умолчанию используйте скриншот на слайде 6. Открывайте тренажёр только при прямой просьбе комиссии или если организаторы заранее требуют живую демонстрацию.</w:t>
-      </w:r>
-    </w:p>
-    <w:p>
-      <w:pPr>
-        <w:spacing w:after="120" w:line="259" w:lineRule="auto"/>
-      </w:pPr>
-      <w:r>
-        <w:rPr>
-          <w:rFonts w:ascii="Arial" w:hAnsi="Arial" w:eastAsia="Arial"/>
-          <w:b/>
-          <w:color w:val="111111"/>
-          <w:sz w:val="23"/>
-        </w:rPr>
-        <w:t xml:space="preserve">Текст показа. </w:t>
-      </w:r>
-      <w:r>
-        <w:rPr>
-          <w:rFonts w:ascii="Arial" w:hAnsi="Arial" w:eastAsia="Arial"/>
-          <w:b w:val="0"/>
-          <w:color w:val="111111"/>
-          <w:sz w:val="23"/>
-        </w:rPr>
-        <w:t>На экране головка находится над символом 0 в состоянии q0. Я выбираю строку q0 и столбец 0, прогнозирую запись 1, движение вправо и состояние q1. Один шаг подтверждает прогноз. Несколько таких шагов позволяют проверить общую закономерность.</w:t>
-      </w:r>
-    </w:p>
-    <w:p>
-      <w:pPr>
-        <w:spacing w:after="120" w:line="259" w:lineRule="auto"/>
-      </w:pPr>
-      <w:r>
-        <w:rPr>
-          <w:rFonts w:ascii="Arial" w:hAnsi="Arial" w:eastAsia="Arial"/>
-          <w:b/>
-          <w:color w:val="111111"/>
-          <w:sz w:val="23"/>
-        </w:rPr>
-        <w:t xml:space="preserve">Резерв. </w:t>
-      </w:r>
-      <w:r>
-        <w:rPr>
-          <w:rFonts w:ascii="Arial" w:hAnsi="Arial" w:eastAsia="Arial"/>
-          <w:b w:val="0"/>
-          <w:color w:val="111111"/>
-          <w:sz w:val="23"/>
-        </w:rPr>
-        <w:t>Если страница не открылась, продолжайте по скриншоту. Не объясняйте техническую причину и не перезапускайте приложение во время защиты.</w:t>
-      </w:r>
-    </w:p>
-    <w:p>
-      <w:pPr>
-        <w:pStyle w:val="Heading1"/>
-      </w:pPr>
-      <w:r>
-        <w:rPr>
-          <w:rFonts w:ascii="Arial" w:hAnsi="Arial" w:eastAsia="Arial"/>
-          <w:b/>
-          <w:color w:val="111111"/>
-          <w:sz w:val="34"/>
-        </w:rPr>
-        <w:t>Вероятные вопросы комиссии</w:t>
-      </w:r>
-    </w:p>
-    <w:tbl>
-      <w:tblPr>
-        <w:tblW w:type="auto" w:w="0"/>
-        <w:jc w:val="center"/>
-        <w:tblLayout w:type="fixed"/>
-        <w:tblLook w:firstColumn="1" w:firstRow="1" w:lastColumn="0" w:lastRow="0" w:noHBand="0" w:noVBand="1" w:val="04A0"/>
-      </w:tblPr>
-      <w:tblGrid>
-        <w:gridCol w:w="4997"/>
-        <w:gridCol w:w="4997"/>
-      </w:tblGrid>
-      <w:tr>
-        <w:trPr>
-          <w:tblHeader w:val="true"/>
-        </w:trPr>
-        <w:tc>
-          <w:tcPr>
-            <w:tcW w:type="dxa" w:w="3384"/>
-            <w:vAlign w:val="center"/>
-            <w:shd w:fill="111111"/>
-            <w:tcBorders>
-              <w:top w:val="single" w:sz="6" w:color="D9D9DE"/>
-              <w:left w:val="single" w:sz="6" w:color="D9D9DE"/>
-              <w:bottom w:val="single" w:sz="6" w:color="D9D9DE"/>
-              <w:right w:val="single" w:sz="6" w:color="D9D9DE"/>
-              <w:insideH w:val="single" w:sz="6" w:color="D9D9DE"/>
-              <w:insideV w:val="single" w:sz="6" w:color="D9D9DE"/>
-            </w:tcBorders>
             <w:tcMar>
               <w:top w:w="100" w:type="dxa"/>
               <w:start w:w="120" w:type="dxa"/>
               <w:bottom w:w="100" w:type="dxa"/>
               <w:end w:w="120" w:type="dxa"/>
             </w:tcMar>
+            <w:shd w:fill="F4F7FA"/>
           </w:tcPr>
           <w:p>
             <w:r>
-              <w:rPr>
-                <w:rFonts w:ascii="Arial" w:hAnsi="Arial" w:eastAsia="Arial"/>
-                <w:b/>
-                <w:color w:val="FFFFFF"/>
-                <w:sz w:val="21"/>
-              </w:rPr>
-              <w:t>Вопрос</w:t>
+              <w:t>Была ли апробация?</w:t>
             </w:r>
           </w:p>
         </w:tc>
         <w:tc>
           <w:tcPr>
-            <w:tcW w:type="dxa" w:w="6552"/>
+            <w:tcW w:type="dxa" w:w="4986"/>
             <w:vAlign w:val="center"/>
-            <w:shd w:fill="111111"/>
-            <w:tcBorders>
-              <w:top w:val="single" w:sz="6" w:color="D9D9DE"/>
-              <w:left w:val="single" w:sz="6" w:color="D9D9DE"/>
-              <w:bottom w:val="single" w:sz="6" w:color="D9D9DE"/>
-              <w:right w:val="single" w:sz="6" w:color="D9D9DE"/>
-              <w:insideH w:val="single" w:sz="6" w:color="D9D9DE"/>
-              <w:insideV w:val="single" w:sz="6" w:color="D9D9DE"/>
-            </w:tcBorders>
             <w:tcMar>
               <w:top w:w="100" w:type="dxa"/>
               <w:start w:w="120" w:type="dxa"/>
               <w:bottom w:w="100" w:type="dxa"/>
               <w:end w:w="120" w:type="dxa"/>
             </w:tcMar>
+            <w:shd w:fill="F4F7FA"/>
           </w:tcPr>
           <w:p>
             <w:r>
-              <w:rPr>
-                <w:rFonts w:ascii="Arial" w:hAnsi="Arial" w:eastAsia="Arial"/>
-                <w:b/>
-                <w:color w:val="FFFFFF"/>
-                <w:sz w:val="21"/>
-              </w:rPr>
-              <w:t>Короткий ответ</w:t>
-            </w:r>
-          </w:p>
-        </w:tc>
-      </w:tr>
-      <w:tr>
-        <w:trPr>
-          <w:cantSplit/>
-        </w:trPr>
-        <w:tc>
-          <w:tcPr>
-            <w:tcW w:type="dxa" w:w="3384"/>
-            <w:vAlign w:val="center"/>
-            <w:tcBorders>
-              <w:top w:val="single" w:sz="6" w:color="D9D9DE"/>
-              <w:left w:val="single" w:sz="6" w:color="D9D9DE"/>
-              <w:bottom w:val="single" w:sz="6" w:color="D9D9DE"/>
-              <w:right w:val="single" w:sz="6" w:color="D9D9DE"/>
-              <w:insideH w:val="single" w:sz="6" w:color="D9D9DE"/>
-              <w:insideV w:val="single" w:sz="6" w:color="D9D9DE"/>
-            </w:tcBorders>
-            <w:tcMar>
-              <w:top w:w="110" w:type="dxa"/>
-              <w:start w:w="120" w:type="dxa"/>
-              <w:bottom w:w="110" w:type="dxa"/>
-              <w:end w:w="120" w:type="dxa"/>
-            </w:tcMar>
-          </w:tcPr>
-          <w:p>
-            <w:r>
-              <w:rPr>
-                <w:rFonts w:ascii="Arial" w:hAnsi="Arial" w:eastAsia="Arial"/>
-                <w:b/>
-                <w:color w:val="111111"/>
-                <w:sz w:val="19"/>
-              </w:rPr>
-              <w:t>Почему это методическая разработка, а не презентация тренажёра?</w:t>
-            </w:r>
-          </w:p>
-        </w:tc>
-        <w:tc>
-          <w:tcPr>
-            <w:tcW w:type="dxa" w:w="6552"/>
-            <w:vAlign w:val="center"/>
-            <w:tcBorders>
-              <w:top w:val="single" w:sz="6" w:color="D9D9DE"/>
-              <w:left w:val="single" w:sz="6" w:color="D9D9DE"/>
-              <w:bottom w:val="single" w:sz="6" w:color="D9D9DE"/>
-              <w:right w:val="single" w:sz="6" w:color="D9D9DE"/>
-              <w:insideH w:val="single" w:sz="6" w:color="D9D9DE"/>
-              <w:insideV w:val="single" w:sz="6" w:color="D9D9DE"/>
-            </w:tcBorders>
-            <w:tcMar>
-              <w:top w:w="110" w:type="dxa"/>
-              <w:start w:w="120" w:type="dxa"/>
-              <w:bottom w:w="110" w:type="dxa"/>
-              <w:end w:w="120" w:type="dxa"/>
-            </w:tcMar>
-          </w:tcPr>
-          <w:p>
-            <w:r>
-              <w:rPr>
-                <w:rFonts w:ascii="Arial" w:hAnsi="Arial" w:eastAsia="Arial"/>
-                <w:b w:val="0"/>
-                <w:color w:val="111111"/>
-                <w:sz w:val="19"/>
-              </w:rPr>
-              <w:t>Объект защиты представляет собой сценарий двух уроков с целями, этапами, ученическим продуктом, КИМами и оцениванием. Тренажёр выполняет роль инструмента исследования и формирующей диагностики.</w:t>
-            </w:r>
-          </w:p>
-        </w:tc>
-      </w:tr>
-      <w:tr>
-        <w:trPr>
-          <w:cantSplit/>
-        </w:trPr>
-        <w:tc>
-          <w:tcPr>
-            <w:tcW w:type="dxa" w:w="3384"/>
-            <w:vAlign w:val="center"/>
-            <w:tcBorders>
-              <w:top w:val="single" w:sz="6" w:color="D9D9DE"/>
-              <w:left w:val="single" w:sz="6" w:color="D9D9DE"/>
-              <w:bottom w:val="single" w:sz="6" w:color="D9D9DE"/>
-              <w:right w:val="single" w:sz="6" w:color="D9D9DE"/>
-              <w:insideH w:val="single" w:sz="6" w:color="D9D9DE"/>
-              <w:insideV w:val="single" w:sz="6" w:color="D9D9DE"/>
-            </w:tcBorders>
-            <w:tcMar>
-              <w:top w:w="110" w:type="dxa"/>
-              <w:start w:w="120" w:type="dxa"/>
-              <w:bottom w:w="110" w:type="dxa"/>
-              <w:end w:w="120" w:type="dxa"/>
-            </w:tcMar>
-            <w:shd w:fill="F5F5F6"/>
-          </w:tcPr>
-          <w:p>
-            <w:r>
-              <w:rPr>
-                <w:rFonts w:ascii="Arial" w:hAnsi="Arial" w:eastAsia="Arial"/>
-                <w:b/>
-                <w:color w:val="111111"/>
-                <w:sz w:val="19"/>
-              </w:rPr>
-              <w:t>Что именно создают ученики?</w:t>
-            </w:r>
-          </w:p>
-        </w:tc>
-        <w:tc>
-          <w:tcPr>
-            <w:tcW w:type="dxa" w:w="6552"/>
-            <w:vAlign w:val="center"/>
-            <w:tcBorders>
-              <w:top w:val="single" w:sz="6" w:color="D9D9DE"/>
-              <w:left w:val="single" w:sz="6" w:color="D9D9DE"/>
-              <w:bottom w:val="single" w:sz="6" w:color="D9D9DE"/>
-              <w:right w:val="single" w:sz="6" w:color="D9D9DE"/>
-              <w:insideH w:val="single" w:sz="6" w:color="D9D9DE"/>
-              <w:insideV w:val="single" w:sz="6" w:color="D9D9DE"/>
-            </w:tcBorders>
-            <w:tcMar>
-              <w:top w:w="110" w:type="dxa"/>
-              <w:start w:w="120" w:type="dxa"/>
-              <w:bottom w:w="110" w:type="dxa"/>
-              <w:end w:w="120" w:type="dxa"/>
-            </w:tcMar>
-            <w:shd w:fill="F5F5F6"/>
-          </w:tcPr>
-          <w:p>
-            <w:r>
-              <w:rPr>
-                <w:rFonts w:ascii="Arial" w:hAnsi="Arial" w:eastAsia="Arial"/>
-                <w:b w:val="0"/>
-                <w:color w:val="111111"/>
-                <w:sz w:val="19"/>
-              </w:rPr>
-              <w:t>Они создают диагностический маршрут. В нём указаны условия выбора полной трассировки, нескольких проверочных шагов и аналитического решения. Маршрут подтверждается данными попыток, примерами и независимой проверкой.</w:t>
-            </w:r>
-          </w:p>
-        </w:tc>
-      </w:tr>
-      <w:tr>
-        <w:trPr>
-          <w:cantSplit/>
-        </w:trPr>
-        <w:tc>
-          <w:tcPr>
-            <w:tcW w:type="dxa" w:w="3384"/>
-            <w:vAlign w:val="center"/>
-            <w:tcBorders>
-              <w:top w:val="single" w:sz="6" w:color="D9D9DE"/>
-              <w:left w:val="single" w:sz="6" w:color="D9D9DE"/>
-              <w:bottom w:val="single" w:sz="6" w:color="D9D9DE"/>
-              <w:right w:val="single" w:sz="6" w:color="D9D9DE"/>
-              <w:insideH w:val="single" w:sz="6" w:color="D9D9DE"/>
-              <w:insideV w:val="single" w:sz="6" w:color="D9D9DE"/>
-            </w:tcBorders>
-            <w:tcMar>
-              <w:top w:w="110" w:type="dxa"/>
-              <w:start w:w="120" w:type="dxa"/>
-              <w:bottom w:w="110" w:type="dxa"/>
-              <w:end w:w="120" w:type="dxa"/>
-            </w:tcMar>
-          </w:tcPr>
-          <w:p>
-            <w:r>
-              <w:rPr>
-                <w:rFonts w:ascii="Arial" w:hAnsi="Arial" w:eastAsia="Arial"/>
-                <w:b/>
-                <w:color w:val="111111"/>
-                <w:sz w:val="19"/>
-              </w:rPr>
-              <w:t>В чём межпредметность занятия?</w:t>
-            </w:r>
-          </w:p>
-        </w:tc>
-        <w:tc>
-          <w:tcPr>
-            <w:tcW w:type="dxa" w:w="6552"/>
-            <w:vAlign w:val="center"/>
-            <w:tcBorders>
-              <w:top w:val="single" w:sz="6" w:color="D9D9DE"/>
-              <w:left w:val="single" w:sz="6" w:color="D9D9DE"/>
-              <w:bottom w:val="single" w:sz="6" w:color="D9D9DE"/>
-              <w:right w:val="single" w:sz="6" w:color="D9D9DE"/>
-              <w:insideH w:val="single" w:sz="6" w:color="D9D9DE"/>
-              <w:insideV w:val="single" w:sz="6" w:color="D9D9DE"/>
-            </w:tcBorders>
-            <w:tcMar>
-              <w:top w:w="110" w:type="dxa"/>
-              <w:start w:w="120" w:type="dxa"/>
-              <w:bottom w:w="110" w:type="dxa"/>
-              <w:end w:w="120" w:type="dxa"/>
-            </w:tcMar>
-          </w:tcPr>
-          <w:p>
-            <w:r>
-              <w:rPr>
-                <w:rFonts w:ascii="Arial" w:hAnsi="Arial" w:eastAsia="Arial"/>
-                <w:b w:val="0"/>
-                <w:color w:val="111111"/>
-                <w:sz w:val="19"/>
-              </w:rPr>
-              <w:t>Информатика даёт формальную модель машины и точное исполнение команд. Математика нужна для гипотезы, цикла или инварианта, проверки граничного случая и обоснования общего вывода.</w:t>
-            </w:r>
-          </w:p>
-        </w:tc>
-      </w:tr>
-      <w:tr>
-        <w:trPr>
-          <w:cantSplit/>
-        </w:trPr>
-        <w:tc>
-          <w:tcPr>
-            <w:tcW w:type="dxa" w:w="3384"/>
-            <w:vAlign w:val="center"/>
-            <w:tcBorders>
-              <w:top w:val="single" w:sz="6" w:color="D9D9DE"/>
-              <w:left w:val="single" w:sz="6" w:color="D9D9DE"/>
-              <w:bottom w:val="single" w:sz="6" w:color="D9D9DE"/>
-              <w:right w:val="single" w:sz="6" w:color="D9D9DE"/>
-              <w:insideH w:val="single" w:sz="6" w:color="D9D9DE"/>
-              <w:insideV w:val="single" w:sz="6" w:color="D9D9DE"/>
-            </w:tcBorders>
-            <w:tcMar>
-              <w:top w:w="110" w:type="dxa"/>
-              <w:start w:w="120" w:type="dxa"/>
-              <w:bottom w:w="110" w:type="dxa"/>
-              <w:end w:w="120" w:type="dxa"/>
-            </w:tcMar>
-            <w:shd w:fill="F5F5F6"/>
-          </w:tcPr>
-          <w:p>
-            <w:r>
-              <w:rPr>
-                <w:rFonts w:ascii="Arial" w:hAnsi="Arial" w:eastAsia="Arial"/>
-                <w:b/>
-                <w:color w:val="111111"/>
-                <w:sz w:val="19"/>
-              </w:rPr>
-              <w:t>Вы отказываетесь от полной трассировки?</w:t>
-            </w:r>
-          </w:p>
-        </w:tc>
-        <w:tc>
-          <w:tcPr>
-            <w:tcW w:type="dxa" w:w="6552"/>
-            <w:vAlign w:val="center"/>
-            <w:tcBorders>
-              <w:top w:val="single" w:sz="6" w:color="D9D9DE"/>
-              <w:left w:val="single" w:sz="6" w:color="D9D9DE"/>
-              <w:bottom w:val="single" w:sz="6" w:color="D9D9DE"/>
-              <w:right w:val="single" w:sz="6" w:color="D9D9DE"/>
-              <w:insideH w:val="single" w:sz="6" w:color="D9D9DE"/>
-              <w:insideV w:val="single" w:sz="6" w:color="D9D9DE"/>
-            </w:tcBorders>
-            <w:tcMar>
-              <w:top w:w="110" w:type="dxa"/>
-              <w:start w:w="120" w:type="dxa"/>
-              <w:bottom w:w="110" w:type="dxa"/>
-              <w:end w:w="120" w:type="dxa"/>
-            </w:tcMar>
-            <w:shd w:fill="F5F5F6"/>
-          </w:tcPr>
-          <w:p>
-            <w:r>
-              <w:rPr>
-                <w:rFonts w:ascii="Arial" w:hAnsi="Arial" w:eastAsia="Arial"/>
-                <w:b w:val="0"/>
-                <w:color w:val="111111"/>
-                <w:sz w:val="19"/>
-              </w:rPr>
-              <w:t>Нет. Полная трассировка остаётся одной из трёх стратегий. Задача ученика состоит в том, чтобы выбрать её по наблюдаемым признакам, а не применять автоматически к любой машине.</w:t>
-            </w:r>
-          </w:p>
-        </w:tc>
-      </w:tr>
-      <w:tr>
-        <w:trPr>
-          <w:cantSplit/>
-        </w:trPr>
-        <w:tc>
-          <w:tcPr>
-            <w:tcW w:type="dxa" w:w="3384"/>
-            <w:vAlign w:val="center"/>
-            <w:tcBorders>
-              <w:top w:val="single" w:sz="6" w:color="D9D9DE"/>
-              <w:left w:val="single" w:sz="6" w:color="D9D9DE"/>
-              <w:bottom w:val="single" w:sz="6" w:color="D9D9DE"/>
-              <w:right w:val="single" w:sz="6" w:color="D9D9DE"/>
-              <w:insideH w:val="single" w:sz="6" w:color="D9D9DE"/>
-              <w:insideV w:val="single" w:sz="6" w:color="D9D9DE"/>
-            </w:tcBorders>
-            <w:tcMar>
-              <w:top w:w="110" w:type="dxa"/>
-              <w:start w:w="120" w:type="dxa"/>
-              <w:bottom w:w="110" w:type="dxa"/>
-              <w:end w:w="120" w:type="dxa"/>
-            </w:tcMar>
-          </w:tcPr>
-          <w:p>
-            <w:r>
-              <w:rPr>
-                <w:rFonts w:ascii="Arial" w:hAnsi="Arial" w:eastAsia="Arial"/>
-                <w:b/>
-                <w:color w:val="111111"/>
-                <w:sz w:val="19"/>
-              </w:rPr>
-              <w:t>Получены ли уже заявленные проценты?</w:t>
-            </w:r>
-          </w:p>
-        </w:tc>
-        <w:tc>
-          <w:tcPr>
-            <w:tcW w:type="dxa" w:w="6552"/>
-            <w:vAlign w:val="center"/>
-            <w:tcBorders>
-              <w:top w:val="single" w:sz="6" w:color="D9D9DE"/>
-              <w:left w:val="single" w:sz="6" w:color="D9D9DE"/>
-              <w:bottom w:val="single" w:sz="6" w:color="D9D9DE"/>
-              <w:right w:val="single" w:sz="6" w:color="D9D9DE"/>
-              <w:insideH w:val="single" w:sz="6" w:color="D9D9DE"/>
-              <w:insideV w:val="single" w:sz="6" w:color="D9D9DE"/>
-            </w:tcBorders>
-            <w:tcMar>
-              <w:top w:w="110" w:type="dxa"/>
-              <w:start w:w="120" w:type="dxa"/>
-              <w:bottom w:w="110" w:type="dxa"/>
-              <w:end w:w="120" w:type="dxa"/>
-            </w:tcMar>
-          </w:tcPr>
-          <w:p>
-            <w:r>
-              <w:rPr>
-                <w:rFonts w:ascii="Arial" w:hAnsi="Arial" w:eastAsia="Arial"/>
-                <w:b w:val="0"/>
-                <w:color w:val="111111"/>
-                <w:sz w:val="19"/>
-              </w:rPr>
-              <w:t>Нет, в текущей версии это целевые ориентиры первого пилота. После проведения мы зафиксируем фактические значения и уточним пороги. В презентации они прямо обозначены как плановые.</w:t>
-            </w:r>
-          </w:p>
-        </w:tc>
-      </w:tr>
-      <w:tr>
-        <w:trPr>
-          <w:cantSplit/>
-        </w:trPr>
-        <w:tc>
-          <w:tcPr>
-            <w:tcW w:type="dxa" w:w="3384"/>
-            <w:vAlign w:val="center"/>
-            <w:tcBorders>
-              <w:top w:val="single" w:sz="6" w:color="D9D9DE"/>
-              <w:left w:val="single" w:sz="6" w:color="D9D9DE"/>
-              <w:bottom w:val="single" w:sz="6" w:color="D9D9DE"/>
-              <w:right w:val="single" w:sz="6" w:color="D9D9DE"/>
-              <w:insideH w:val="single" w:sz="6" w:color="D9D9DE"/>
-              <w:insideV w:val="single" w:sz="6" w:color="D9D9DE"/>
-            </w:tcBorders>
-            <w:tcMar>
-              <w:top w:w="110" w:type="dxa"/>
-              <w:start w:w="120" w:type="dxa"/>
-              <w:bottom w:w="110" w:type="dxa"/>
-              <w:end w:w="120" w:type="dxa"/>
-            </w:tcMar>
-            <w:shd w:fill="F5F5F6"/>
-          </w:tcPr>
-          <w:p>
-            <w:r>
-              <w:rPr>
-                <w:rFonts w:ascii="Arial" w:hAnsi="Arial" w:eastAsia="Arial"/>
-                <w:b/>
-                <w:color w:val="111111"/>
-                <w:sz w:val="19"/>
-              </w:rPr>
-              <w:t>Как проверяется результат занятия?</w:t>
-            </w:r>
-          </w:p>
-        </w:tc>
-        <w:tc>
-          <w:tcPr>
-            <w:tcW w:type="dxa" w:w="6552"/>
-            <w:vAlign w:val="center"/>
-            <w:tcBorders>
-              <w:top w:val="single" w:sz="6" w:color="D9D9DE"/>
-              <w:left w:val="single" w:sz="6" w:color="D9D9DE"/>
-              <w:bottom w:val="single" w:sz="6" w:color="D9D9DE"/>
-              <w:right w:val="single" w:sz="6" w:color="D9D9DE"/>
-              <w:insideH w:val="single" w:sz="6" w:color="D9D9DE"/>
-              <w:insideV w:val="single" w:sz="6" w:color="D9D9DE"/>
-            </w:tcBorders>
-            <w:tcMar>
-              <w:top w:w="110" w:type="dxa"/>
-              <w:start w:w="120" w:type="dxa"/>
-              <w:bottom w:w="110" w:type="dxa"/>
-              <w:end w:w="120" w:type="dxa"/>
-            </w:tcMar>
-            <w:shd w:fill="F5F5F6"/>
-          </w:tcPr>
-          <w:p>
-            <w:r>
-              <w:rPr>
-                <w:rFonts w:ascii="Arial" w:hAnsi="Arial" w:eastAsia="Arial"/>
-                <w:b w:val="0"/>
-                <w:color w:val="111111"/>
-                <w:sz w:val="19"/>
-              </w:rPr>
-              <w:t>Мы сопоставляем входную и итоговую попытки, смотрим данные минимум трёх решений, проверяем маршрут на другой команде и оцениваем продукт по пяти критериям от 0 до 3 баллов.</w:t>
-            </w:r>
-          </w:p>
-        </w:tc>
-      </w:tr>
-      <w:tr>
-        <w:trPr>
-          <w:cantSplit/>
-        </w:trPr>
-        <w:tc>
-          <w:tcPr>
-            <w:tcW w:type="dxa" w:w="3384"/>
-            <w:vAlign w:val="center"/>
-            <w:tcBorders>
-              <w:top w:val="single" w:sz="6" w:color="D9D9DE"/>
-              <w:left w:val="single" w:sz="6" w:color="D9D9DE"/>
-              <w:bottom w:val="single" w:sz="6" w:color="D9D9DE"/>
-              <w:right w:val="single" w:sz="6" w:color="D9D9DE"/>
-              <w:insideH w:val="single" w:sz="6" w:color="D9D9DE"/>
-              <w:insideV w:val="single" w:sz="6" w:color="D9D9DE"/>
-            </w:tcBorders>
-            <w:tcMar>
-              <w:top w:w="110" w:type="dxa"/>
-              <w:start w:w="120" w:type="dxa"/>
-              <w:bottom w:w="110" w:type="dxa"/>
-              <w:end w:w="120" w:type="dxa"/>
-            </w:tcMar>
-          </w:tcPr>
-          <w:p>
-            <w:r>
-              <w:rPr>
-                <w:rFonts w:ascii="Arial" w:hAnsi="Arial" w:eastAsia="Arial"/>
-                <w:b/>
-                <w:color w:val="111111"/>
-                <w:sz w:val="19"/>
-              </w:rPr>
-              <w:t>Зачем использовать ИИ?</w:t>
-            </w:r>
-          </w:p>
-        </w:tc>
-        <w:tc>
-          <w:tcPr>
-            <w:tcW w:type="dxa" w:w="6552"/>
-            <w:vAlign w:val="center"/>
-            <w:tcBorders>
-              <w:top w:val="single" w:sz="6" w:color="D9D9DE"/>
-              <w:left w:val="single" w:sz="6" w:color="D9D9DE"/>
-              <w:bottom w:val="single" w:sz="6" w:color="D9D9DE"/>
-              <w:right w:val="single" w:sz="6" w:color="D9D9DE"/>
-              <w:insideH w:val="single" w:sz="6" w:color="D9D9DE"/>
-              <w:insideV w:val="single" w:sz="6" w:color="D9D9DE"/>
-            </w:tcBorders>
-            <w:tcMar>
-              <w:top w:w="110" w:type="dxa"/>
-              <w:start w:w="120" w:type="dxa"/>
-              <w:bottom w:w="110" w:type="dxa"/>
-              <w:end w:w="120" w:type="dxa"/>
-            </w:tcMar>
-          </w:tcPr>
-          <w:p>
-            <w:r>
-              <w:rPr>
-                <w:rFonts w:ascii="Arial" w:hAnsi="Arial" w:eastAsia="Arial"/>
-                <w:b w:val="0"/>
-                <w:color w:val="111111"/>
-                <w:sz w:val="19"/>
-              </w:rPr>
-              <w:t>ИИ необязателен. Он может предложить объяснение или возражение. Ученик выделяет проверяемое утверждение, проверяет его в тренажёре и на дополнительном примере, затем фиксирует подтверждение или исправление.</w:t>
-            </w:r>
-          </w:p>
-        </w:tc>
-      </w:tr>
-      <w:tr>
-        <w:trPr>
-          <w:cantSplit/>
-        </w:trPr>
-        <w:tc>
-          <w:tcPr>
-            <w:tcW w:type="dxa" w:w="3384"/>
-            <w:vAlign w:val="center"/>
-            <w:tcBorders>
-              <w:top w:val="single" w:sz="6" w:color="D9D9DE"/>
-              <w:left w:val="single" w:sz="6" w:color="D9D9DE"/>
-              <w:bottom w:val="single" w:sz="6" w:color="D9D9DE"/>
-              <w:right w:val="single" w:sz="6" w:color="D9D9DE"/>
-              <w:insideH w:val="single" w:sz="6" w:color="D9D9DE"/>
-              <w:insideV w:val="single" w:sz="6" w:color="D9D9DE"/>
-            </w:tcBorders>
-            <w:tcMar>
-              <w:top w:w="110" w:type="dxa"/>
-              <w:start w:w="120" w:type="dxa"/>
-              <w:bottom w:w="110" w:type="dxa"/>
-              <w:end w:w="120" w:type="dxa"/>
-            </w:tcMar>
-            <w:shd w:fill="F5F5F6"/>
-          </w:tcPr>
-          <w:p>
-            <w:r>
-              <w:rPr>
-                <w:rFonts w:ascii="Arial" w:hAnsi="Arial" w:eastAsia="Arial"/>
-                <w:b/>
-                <w:color w:val="111111"/>
-                <w:sz w:val="19"/>
-              </w:rPr>
-              <w:t>Что произойдёт без интернета или компьютеров?</w:t>
-            </w:r>
-          </w:p>
-        </w:tc>
-        <w:tc>
-          <w:tcPr>
-            <w:tcW w:type="dxa" w:w="6552"/>
-            <w:vAlign w:val="center"/>
-            <w:tcBorders>
-              <w:top w:val="single" w:sz="6" w:color="D9D9DE"/>
-              <w:left w:val="single" w:sz="6" w:color="D9D9DE"/>
-              <w:bottom w:val="single" w:sz="6" w:color="D9D9DE"/>
-              <w:right w:val="single" w:sz="6" w:color="D9D9DE"/>
-              <w:insideH w:val="single" w:sz="6" w:color="D9D9DE"/>
-              <w:insideV w:val="single" w:sz="6" w:color="D9D9DE"/>
-            </w:tcBorders>
-            <w:tcMar>
-              <w:top w:w="110" w:type="dxa"/>
-              <w:start w:w="120" w:type="dxa"/>
-              <w:bottom w:w="110" w:type="dxa"/>
-              <w:end w:w="120" w:type="dxa"/>
-            </w:tcMar>
-            <w:shd w:fill="F5F5F6"/>
-          </w:tcPr>
-          <w:p>
-            <w:r>
-              <w:rPr>
-                <w:rFonts w:ascii="Arial" w:hAnsi="Arial" w:eastAsia="Arial"/>
-                <w:b w:val="0"/>
-                <w:color w:val="111111"/>
-                <w:sz w:val="19"/>
-              </w:rPr>
-              <w:t>Без сети запускается автономный HTML-файл. Без компьютеров учитель выдаёт таблицы команд и подготовленные данные попыток. Ученики сохраняют анализ, выбор стратегии и сборку маршрута.</w:t>
-            </w:r>
-          </w:p>
-        </w:tc>
-      </w:tr>
-      <w:tr>
-        <w:trPr>
-          <w:cantSplit/>
-        </w:trPr>
-        <w:tc>
-          <w:tcPr>
-            <w:tcW w:type="dxa" w:w="3384"/>
-            <w:vAlign w:val="center"/>
-            <w:tcBorders>
-              <w:top w:val="single" w:sz="6" w:color="D9D9DE"/>
-              <w:left w:val="single" w:sz="6" w:color="D9D9DE"/>
-              <w:bottom w:val="single" w:sz="6" w:color="D9D9DE"/>
-              <w:right w:val="single" w:sz="6" w:color="D9D9DE"/>
-              <w:insideH w:val="single" w:sz="6" w:color="D9D9DE"/>
-              <w:insideV w:val="single" w:sz="6" w:color="D9D9DE"/>
-            </w:tcBorders>
-            <w:tcMar>
-              <w:top w:w="110" w:type="dxa"/>
-              <w:start w:w="120" w:type="dxa"/>
-              <w:bottom w:w="110" w:type="dxa"/>
-              <w:end w:w="120" w:type="dxa"/>
-            </w:tcMar>
-          </w:tcPr>
-          <w:p>
-            <w:r>
-              <w:rPr>
-                <w:rFonts w:ascii="Arial" w:hAnsi="Arial" w:eastAsia="Arial"/>
-                <w:b/>
-                <w:color w:val="111111"/>
-                <w:sz w:val="19"/>
-              </w:rPr>
-              <w:t>Как другой учитель сможет повторить занятие?</w:t>
-            </w:r>
-          </w:p>
-        </w:tc>
-        <w:tc>
-          <w:tcPr>
-            <w:tcW w:type="dxa" w:w="6552"/>
-            <w:vAlign w:val="center"/>
-            <w:tcBorders>
-              <w:top w:val="single" w:sz="6" w:color="D9D9DE"/>
-              <w:left w:val="single" w:sz="6" w:color="D9D9DE"/>
-              <w:bottom w:val="single" w:sz="6" w:color="D9D9DE"/>
-              <w:right w:val="single" w:sz="6" w:color="D9D9DE"/>
-              <w:insideH w:val="single" w:sz="6" w:color="D9D9DE"/>
-              <w:insideV w:val="single" w:sz="6" w:color="D9D9DE"/>
-            </w:tcBorders>
-            <w:tcMar>
-              <w:top w:w="110" w:type="dxa"/>
-              <w:start w:w="120" w:type="dxa"/>
-              <w:bottom w:w="110" w:type="dxa"/>
-              <w:end w:w="120" w:type="dxa"/>
-            </w:tcMar>
-          </w:tcPr>
-          <w:p>
-            <w:r>
-              <w:rPr>
-                <w:rFonts w:ascii="Arial" w:hAnsi="Arial" w:eastAsia="Arial"/>
-                <w:b w:val="0"/>
-                <w:color w:val="111111"/>
-                <w:sz w:val="19"/>
-              </w:rPr>
-              <w:t>Он получает комплект учителя, проектный кейс, рабочий лист, шаблон маршрута, КИМы, ключи, рубрикатор и автономную версию тренажёра. Все пять спринтов расписаны по времени и наблюдаемому результату.</w:t>
-            </w:r>
-          </w:p>
-        </w:tc>
-      </w:tr>
-      <w:tr>
-        <w:trPr>
-          <w:cantSplit/>
-        </w:trPr>
-        <w:tc>
-          <w:tcPr>
-            <w:tcW w:type="dxa" w:w="3384"/>
-            <w:vAlign w:val="center"/>
-            <w:tcBorders>
-              <w:top w:val="single" w:sz="6" w:color="D9D9DE"/>
-              <w:left w:val="single" w:sz="6" w:color="D9D9DE"/>
-              <w:bottom w:val="single" w:sz="6" w:color="D9D9DE"/>
-              <w:right w:val="single" w:sz="6" w:color="D9D9DE"/>
-              <w:insideH w:val="single" w:sz="6" w:color="D9D9DE"/>
-              <w:insideV w:val="single" w:sz="6" w:color="D9D9DE"/>
-            </w:tcBorders>
-            <w:tcMar>
-              <w:top w:w="110" w:type="dxa"/>
-              <w:start w:w="120" w:type="dxa"/>
-              <w:bottom w:w="110" w:type="dxa"/>
-              <w:end w:w="120" w:type="dxa"/>
-            </w:tcMar>
-            <w:shd w:fill="F5F5F6"/>
-          </w:tcPr>
-          <w:p>
-            <w:r>
-              <w:rPr>
-                <w:rFonts w:ascii="Arial" w:hAnsi="Arial" w:eastAsia="Arial"/>
-                <w:b/>
-                <w:color w:val="111111"/>
-                <w:sz w:val="19"/>
-              </w:rPr>
-              <w:t>В чём практическая ценность разработки?</w:t>
-            </w:r>
-          </w:p>
-        </w:tc>
-        <w:tc>
-          <w:tcPr>
-            <w:tcW w:type="dxa" w:w="6552"/>
-            <w:vAlign w:val="center"/>
-            <w:tcBorders>
-              <w:top w:val="single" w:sz="6" w:color="D9D9DE"/>
-              <w:left w:val="single" w:sz="6" w:color="D9D9DE"/>
-              <w:bottom w:val="single" w:sz="6" w:color="D9D9DE"/>
-              <w:right w:val="single" w:sz="6" w:color="D9D9DE"/>
-              <w:insideH w:val="single" w:sz="6" w:color="D9D9DE"/>
-              <w:insideV w:val="single" w:sz="6" w:color="D9D9DE"/>
-            </w:tcBorders>
-            <w:tcMar>
-              <w:top w:w="110" w:type="dxa"/>
-              <w:start w:w="120" w:type="dxa"/>
-              <w:bottom w:w="110" w:type="dxa"/>
-              <w:end w:w="120" w:type="dxa"/>
-            </w:tcMar>
-            <w:shd w:fill="F5F5F6"/>
-          </w:tcPr>
-          <w:p>
-            <w:r>
-              <w:rPr>
-                <w:rFonts w:ascii="Arial" w:hAnsi="Arial" w:eastAsia="Arial"/>
-                <w:b w:val="0"/>
-                <w:color w:val="111111"/>
-                <w:sz w:val="19"/>
-              </w:rPr>
-              <w:t>Учитель видит не только итоговый ответ, но и стратегию, данные попыток и место ошибки. Ученик получает воспроизводимый способ перейти от пошагового исполнения к доказанному аналитическому выводу.</w:t>
+              <w:t>В материалах нет заявления о проведённой апробации; метрики целевые.</w:t>
             </w:r>
           </w:p>
         </w:tc>
       </w:tr>
     </w:tbl>
+    <w:p/>
     <w:p>
       <w:pPr>
         <w:pStyle w:val="Heading1"/>
       </w:pPr>
       <w:r>
-        <w:rPr>
-          <w:rFonts w:ascii="Arial" w:hAnsi="Arial" w:eastAsia="Arial"/>
-          <w:b/>
-          <w:color w:val="111111"/>
-          <w:sz w:val="34"/>
-        </w:rPr>
-        <w:t>Подготовка перед выходом</w:t>
+        <w:t>Инструкция демонстрации</w:t>
       </w:r>
     </w:p>
     <w:p>
       <w:pPr>
         <w:pStyle w:val="ListBullet"/>
-        <w:spacing w:after="60"/>
-        <w:ind w:left="360" w:hanging="216"/>
       </w:pPr>
       <w:r>
-        <w:rPr>
-          <w:rFonts w:ascii="Arial" w:hAnsi="Arial" w:eastAsia="Arial"/>
-          <w:b w:val="0"/>
-          <w:color w:val="111111"/>
-          <w:sz w:val="22"/>
-        </w:rPr>
-        <w:t>Открыть презентацию и проверить переход на слайд 6.</w:t>
+        <w:t>На слайде 5 кратко показать различие свободной попытки и контролируемой пары.</w:t>
       </w:r>
     </w:p>
     <w:p>
       <w:pPr>
         <w:pStyle w:val="ListBullet"/>
-        <w:spacing w:after="60"/>
-        <w:ind w:left="360" w:hanging="216"/>
       </w:pPr>
       <w:r>
-        <w:rPr>
-          <w:rFonts w:ascii="Arial" w:hAnsi="Arial" w:eastAsia="Arial"/>
-          <w:b w:val="0"/>
-          <w:color w:val="111111"/>
-          <w:sz w:val="22"/>
-        </w:rPr>
-        <w:t>Открыть тренажёр заранее только для возможного показа по просьбе комиссии.</w:t>
+        <w:t>На слайде 6 назвать файлы, которые реально видны в составе комплекта.</w:t>
       </w:r>
     </w:p>
     <w:p>
       <w:pPr>
         <w:pStyle w:val="ListBullet"/>
-        <w:spacing w:after="60"/>
-        <w:ind w:left="360" w:hanging="216"/>
       </w:pPr>
       <w:r>
-        <w:rPr>
-          <w:rFonts w:ascii="Arial" w:hAnsi="Arial" w:eastAsia="Arial"/>
-          <w:b w:val="0"/>
-          <w:color w:val="111111"/>
-          <w:sz w:val="22"/>
-        </w:rPr>
-        <w:t>Держать автономный файл рядом с презентацией.</w:t>
+        <w:t>На слайде 8 при наличии времени открыть лендинг и раздел материалов.</w:t>
       </w:r>
     </w:p>
     <w:p>
       <w:pPr>
         <w:pStyle w:val="ListBullet"/>
-        <w:spacing w:after="60"/>
-        <w:ind w:left="360" w:hanging="216"/>
       </w:pPr>
       <w:r>
-        <w:rPr>
-          <w:rFonts w:ascii="Arial" w:hAnsi="Arial" w:eastAsia="Arial"/>
-          <w:b w:val="0"/>
-          <w:color w:val="111111"/>
-          <w:sz w:val="22"/>
-        </w:rPr>
-        <w:t>Провести минимум две репетиции с секундомером.</w:t>
-      </w:r>
-    </w:p>
-    <w:p>
-      <w:pPr>
-        <w:pStyle w:val="ListBullet"/>
-        <w:spacing w:after="60"/>
-        <w:ind w:left="360" w:hanging="216"/>
-      </w:pPr>
-      <w:r>
-        <w:rPr>
-          <w:rFonts w:ascii="Arial" w:hAnsi="Arial" w:eastAsia="Arial"/>
-          <w:b w:val="0"/>
-          <w:color w:val="111111"/>
-          <w:sz w:val="22"/>
-        </w:rPr>
-        <w:t>На отметке 3:28 закончить выступление и оставить слайд 9 на экране.</w:t>
+        <w:t>Не запускать длинную трассировку во время защиты.</w:t>
       </w:r>
     </w:p>
     <w:sectPr>
+      <w:footerReference w:type="default" r:id="rId9"/>
       <w:pgSz w:w="12240" w:h="15840"/>
-      <w:pgMar w:top="979" w:right="1123" w:bottom="979" w:left="1123" w:header="720" w:footer="720" w:gutter="0"/>
+      <w:pgMar w:top="1020" w:right="1134" w:bottom="964" w:left="1134" w:header="720" w:footer="720" w:gutter="0"/>
       <w:cols w:space="720"/>
       <w:docGrid w:linePitch="360"/>
     </w:sectPr>
   </w:body>
 </w:document>
+</file>
+
+<file path=word/footer1.xml><?xml version="1.0" encoding="utf-8"?>
+<w:ftr xmlns:m="http://schemas.openxmlformats.org/officeDocument/2006/math" xmlns:mc="http://schemas.openxmlformats.org/markup-compatibility/2006" xmlns:mo="http://schemas.microsoft.com/office/mac/office/2008/main" xmlns:mv="urn:schemas-microsoft-com:mac:vml" xmlns:o="urn:schemas-microsoft-com:office:office" xmlns:r="http://schemas.openxmlformats.org/officeDocument/2006/relationships" xmlns:v="urn:schemas-microsoft-com:vml" xmlns:w10="urn:schemas-microsoft-com:office:word" xmlns:w14="http://schemas.microsoft.com/office/word/2010/wordml" xmlns:w="http://schemas.openxmlformats.org/wordprocessingml/2006/main" xmlns:wne="http://schemas.microsoft.com/office/word/2006/wordml" xmlns:wp14="http://schemas.microsoft.com/office/word/2010/wordprocessingDrawing" xmlns:wp="http://schemas.openxmlformats.org/drawingml/2006/wordprocessingDrawing" xmlns:wpc="http://schemas.microsoft.com/office/word/2010/wordprocessingCanvas" xmlns:wpg="http://schemas.microsoft.com/office/word/2010/wordprocessingGroup" xmlns:wpi="http://schemas.microsoft.com/office/word/2010/wordprocessingInk" xmlns:wps="http://schemas.microsoft.com/office/word/2010/wordprocessingShape" mc:Ignorable="w14 wp14">
+  <w:p>
+    <w:pPr>
+      <w:pStyle w:val="Footer"/>
+      <w:jc w:val="center"/>
+    </w:pPr>
+    <w:r>
+      <w:rPr>
+        <w:sz w:val="16"/>
+      </w:rPr>
+      <w:t>TuringTrainer · учебный комплект · 11 класс · 2 × 45 минут</w:t>
+    </w:r>
+  </w:p>
+</w:ftr>
 </file>
 
 <file path=word/numbering.xml><?xml version="1.0" encoding="utf-8"?>
@@ -3143,10 +895,12 @@
     <w:name w:val="Normal"/>
     <w:qFormat/>
     <w:rsid w:val="00FC693F"/>
+    <w:pPr>
+      <w:spacing w:after="120"/>
+    </w:pPr>
     <w:rPr>
-      <w:rFonts w:ascii="Arial" w:hAnsi="Arial"/>
-      <w:color w:val="111111"/>
-      <w:sz w:val="23"/>
+      <w:rFonts w:ascii="Aptos" w:hAnsi="Aptos" w:eastAsia="Aptos"/>
+      <w:sz w:val="21"/>
     </w:rPr>
   </w:style>
   <w:style w:type="paragraph" w:styleId="Header">
@@ -3208,10 +962,10 @@
       <w:outlineLvl w:val="0"/>
     </w:pPr>
     <w:rPr>
-      <w:rFonts w:asciiTheme="majorHAnsi" w:eastAsiaTheme="majorEastAsia" w:hAnsiTheme="majorHAnsi" w:cstheme="majorBidi" w:ascii="Arial" w:hAnsi="Arial"/>
+      <w:rFonts w:asciiTheme="majorHAnsi" w:eastAsiaTheme="majorEastAsia" w:hAnsiTheme="majorHAnsi" w:cstheme="majorBidi" w:ascii="Aptos Display" w:hAnsi="Aptos Display" w:eastAsia="Aptos Display"/>
       <w:b/>
       <w:bCs/>
-      <w:color w:val="111111"/>
+      <w:color w:val="000000"/>
       <w:sz w:val="34"/>
       <w:szCs w:val="28"/>
     </w:rPr>
@@ -3232,11 +986,11 @@
       <w:outlineLvl w:val="1"/>
     </w:pPr>
     <w:rPr>
-      <w:rFonts w:asciiTheme="majorHAnsi" w:eastAsiaTheme="majorEastAsia" w:hAnsiTheme="majorHAnsi" w:cstheme="majorBidi" w:ascii="Arial" w:hAnsi="Arial"/>
+      <w:rFonts w:asciiTheme="majorHAnsi" w:eastAsiaTheme="majorEastAsia" w:hAnsiTheme="majorHAnsi" w:cstheme="majorBidi" w:ascii="Aptos Display" w:hAnsi="Aptos Display" w:eastAsia="Aptos Display"/>
       <w:b/>
       <w:bCs/>
-      <w:color w:val="111111"/>
-      <w:sz w:val="27"/>
+      <w:color w:val="000000"/>
+      <w:sz w:val="26"/>
       <w:szCs w:val="26"/>
     </w:rPr>
   </w:style>
@@ -3490,13 +1244,15 @@
     <w:qFormat/>
     <w:rsid w:val="00FC693F"/>
     <w:pPr>
+      <w:pBdr>
+        <w:bottom w:val="single" w:sz="8" w:space="4" w:color="4F81BD" w:themeColor="accent1"/>
+      </w:pBdr>
       <w:spacing w:after="300" w:line="240" w:lineRule="auto"/>
       <w:contextualSpacing/>
     </w:pPr>
     <w:rPr>
-      <w:rFonts w:asciiTheme="majorHAnsi" w:eastAsiaTheme="majorEastAsia" w:hAnsiTheme="majorHAnsi" w:cstheme="majorBidi" w:ascii="Arial" w:hAnsi="Arial"/>
-      <w:b/>
-      <w:color w:val="111111"/>
+      <w:rFonts w:asciiTheme="majorHAnsi" w:eastAsiaTheme="majorEastAsia" w:hAnsiTheme="majorHAnsi" w:cstheme="majorBidi" w:ascii="Aptos Display" w:hAnsi="Aptos Display" w:eastAsia="Aptos Display"/>
+      <w:color w:val="000000"/>
       <w:spacing w:val="5"/>
       <w:kern w:val="28"/>
       <w:sz w:val="48"/>

</xml_diff>